<commit_message>
Fachkonzept: Checklisten-Prozess ergänzt, Stammdatenpflege zurückgestellt
- Neuer Prozess: Werker arbeiten im Arbeitsgang Checklisten ab und liefern
  die Daten für das Werkszertifikat, Meister prüft und gibt frei
- Neue Anwendungsfälle 9 (Checkliste abarbeiten) und 15 (Werkszertifikat), jetzt 18
- Prozess „Stammdaten pflegen“ vorerst herausgenommen (liegt in prozesse/zurueckgestellt)
- Überblick und Nachvollziehbarkeit ergänzt
- Diagrammdateien mit sprechenden Namen, Erzeugungsskript baut nur noch auf,
  Speichern und PDF-Export in Word (Speichern per Skript hängt auf diesem Rechner)

Co-Authored-By: Claude Opus 5.5 <noreply@anthropic.com>
</commit_message>
<xml_diff>
--- a/doku/Fachkonzept_FA-Digital.docx
+++ b/doku/Fachkonzept_FA-Digital.docx
@@ -105,7 +105,7 @@
         <w:rPr>
           <w:noProof/>
         </w:rPr>
-        <w:instrText xml:space="preserve"> PAGEREF _Toc241407930 \h </w:instrText>
+        <w:instrText xml:space="preserve"> PAGEREF _Toc241409233 \h </w:instrText>
       </w:r>
       <w:r>
         <w:rPr>
@@ -166,7 +166,7 @@
         <w:rPr>
           <w:noProof/>
         </w:rPr>
-        <w:instrText xml:space="preserve"> PAGEREF _Toc241407931 \h </w:instrText>
+        <w:instrText xml:space="preserve"> PAGEREF _Toc241409234 \h </w:instrText>
       </w:r>
       <w:r>
         <w:rPr>
@@ -209,7 +209,7 @@
         <w:rPr>
           <w:noProof/>
         </w:rPr>
-        <w:t>Stammdaten pflegen</w:t>
+        <w:t>Fertigungsauftrag abwickeln</w:t>
       </w:r>
       <w:r>
         <w:rPr>
@@ -227,7 +227,7 @@
         <w:rPr>
           <w:noProof/>
         </w:rPr>
-        <w:instrText xml:space="preserve"> PAGEREF _Toc241407932 \h </w:instrText>
+        <w:instrText xml:space="preserve"> PAGEREF _Toc241409235 \h </w:instrText>
       </w:r>
       <w:r>
         <w:rPr>
@@ -270,7 +270,7 @@
         <w:rPr>
           <w:noProof/>
         </w:rPr>
-        <w:t>Fertigungsauftrag abwickeln</w:t>
+        <w:t>Checklisten abarbeiten und Werkszertifikat erstellen</w:t>
       </w:r>
       <w:r>
         <w:rPr>
@@ -288,7 +288,7 @@
         <w:rPr>
           <w:noProof/>
         </w:rPr>
-        <w:instrText xml:space="preserve"> PAGEREF _Toc241407933 \h </w:instrText>
+        <w:instrText xml:space="preserve"> PAGEREF _Toc241409236 \h </w:instrText>
       </w:r>
       <w:r>
         <w:rPr>
@@ -349,7 +349,7 @@
         <w:rPr>
           <w:noProof/>
         </w:rPr>
-        <w:instrText xml:space="preserve"> PAGEREF _Toc241407934 \h </w:instrText>
+        <w:instrText xml:space="preserve"> PAGEREF _Toc241409237 \h </w:instrText>
       </w:r>
       <w:r>
         <w:rPr>
@@ -410,7 +410,7 @@
         <w:rPr>
           <w:noProof/>
         </w:rPr>
-        <w:instrText xml:space="preserve"> PAGEREF _Toc241407935 \h </w:instrText>
+        <w:instrText xml:space="preserve"> PAGEREF _Toc241409238 \h </w:instrText>
       </w:r>
       <w:r>
         <w:rPr>
@@ -471,7 +471,7 @@
         <w:rPr>
           <w:noProof/>
         </w:rPr>
-        <w:instrText xml:space="preserve"> PAGEREF _Toc241407936 \h </w:instrText>
+        <w:instrText xml:space="preserve"> PAGEREF _Toc241409239 \h </w:instrText>
       </w:r>
       <w:r>
         <w:rPr>
@@ -532,7 +532,7 @@
         <w:rPr>
           <w:noProof/>
         </w:rPr>
-        <w:instrText xml:space="preserve"> PAGEREF _Toc241407937 \h </w:instrText>
+        <w:instrText xml:space="preserve"> PAGEREF _Toc241409240 \h </w:instrText>
       </w:r>
       <w:r>
         <w:rPr>
@@ -593,7 +593,7 @@
         <w:rPr>
           <w:noProof/>
         </w:rPr>
-        <w:instrText xml:space="preserve"> PAGEREF _Toc241407938 \h </w:instrText>
+        <w:instrText xml:space="preserve"> PAGEREF _Toc241409241 \h </w:instrText>
       </w:r>
       <w:r>
         <w:rPr>
@@ -654,7 +654,7 @@
         <w:rPr>
           <w:noProof/>
         </w:rPr>
-        <w:instrText xml:space="preserve"> PAGEREF _Toc241407939 \h </w:instrText>
+        <w:instrText xml:space="preserve"> PAGEREF _Toc241409242 \h </w:instrText>
       </w:r>
       <w:r>
         <w:rPr>
@@ -715,7 +715,7 @@
         <w:rPr>
           <w:noProof/>
         </w:rPr>
-        <w:instrText xml:space="preserve"> PAGEREF _Toc241407940 \h </w:instrText>
+        <w:instrText xml:space="preserve"> PAGEREF _Toc241409243 \h </w:instrText>
       </w:r>
       <w:r>
         <w:rPr>
@@ -776,7 +776,7 @@
         <w:rPr>
           <w:noProof/>
         </w:rPr>
-        <w:instrText xml:space="preserve"> PAGEREF _Toc241407941 \h </w:instrText>
+        <w:instrText xml:space="preserve"> PAGEREF _Toc241409244 \h </w:instrText>
       </w:r>
       <w:r>
         <w:rPr>
@@ -837,7 +837,7 @@
         <w:rPr>
           <w:noProof/>
         </w:rPr>
-        <w:instrText xml:space="preserve"> PAGEREF _Toc241407942 \h </w:instrText>
+        <w:instrText xml:space="preserve"> PAGEREF _Toc241409245 \h </w:instrText>
       </w:r>
       <w:r>
         <w:rPr>
@@ -898,7 +898,7 @@
         <w:rPr>
           <w:noProof/>
         </w:rPr>
-        <w:instrText xml:space="preserve"> PAGEREF _Toc241407943 \h </w:instrText>
+        <w:instrText xml:space="preserve"> PAGEREF _Toc241409246 \h </w:instrText>
       </w:r>
       <w:r>
         <w:rPr>
@@ -941,7 +941,7 @@
         <w:rPr>
           <w:noProof/>
         </w:rPr>
-        <w:t>Anwendungsfall 9: Fertigmeldung eines Arbeitsgangs durch den Werker</w:t>
+        <w:t>Anwendungsfall 9: Abarbeitung der Checkliste eines Arbeitsgangs durch den Werker</w:t>
       </w:r>
       <w:r>
         <w:rPr>
@@ -959,7 +959,7 @@
         <w:rPr>
           <w:noProof/>
         </w:rPr>
-        <w:instrText xml:space="preserve"> PAGEREF _Toc241407944 \h </w:instrText>
+        <w:instrText xml:space="preserve"> PAGEREF _Toc241409247 \h </w:instrText>
       </w:r>
       <w:r>
         <w:rPr>
@@ -1002,7 +1002,7 @@
         <w:rPr>
           <w:noProof/>
         </w:rPr>
-        <w:t>Anwendungsfall 10: Nachtragen und Korrigieren von Buchungen durch den Meister</w:t>
+        <w:t>Anwendungsfall 10: Fertigmeldung eines Arbeitsgangs durch den Werker</w:t>
       </w:r>
       <w:r>
         <w:rPr>
@@ -1020,7 +1020,7 @@
         <w:rPr>
           <w:noProof/>
         </w:rPr>
-        <w:instrText xml:space="preserve"> PAGEREF _Toc241407945 \h </w:instrText>
+        <w:instrText xml:space="preserve"> PAGEREF _Toc241409248 \h </w:instrText>
       </w:r>
       <w:r>
         <w:rPr>
@@ -1063,7 +1063,7 @@
         <w:rPr>
           <w:noProof/>
         </w:rPr>
-        <w:t>Anwendungsfall 11: Anzeige der Hallenansicht für den Meister</w:t>
+        <w:t>Anwendungsfall 11: Nachtragen und Korrigieren von Buchungen durch den Meister</w:t>
       </w:r>
       <w:r>
         <w:rPr>
@@ -1081,7 +1081,7 @@
         <w:rPr>
           <w:noProof/>
         </w:rPr>
-        <w:instrText xml:space="preserve"> PAGEREF _Toc241407946 \h </w:instrText>
+        <w:instrText xml:space="preserve"> PAGEREF _Toc241409249 \h </w:instrText>
       </w:r>
       <w:r>
         <w:rPr>
@@ -1124,7 +1124,7 @@
         <w:rPr>
           <w:noProof/>
         </w:rPr>
-        <w:t>Anwendungsfall 12: Anzeige der Auftragsübersicht für alle Rollen</w:t>
+        <w:t>Anwendungsfall 12: Anzeige der Hallenansicht für den Meister</w:t>
       </w:r>
       <w:r>
         <w:rPr>
@@ -1142,7 +1142,7 @@
         <w:rPr>
           <w:noProof/>
         </w:rPr>
-        <w:instrText xml:space="preserve"> PAGEREF _Toc241407947 \h </w:instrText>
+        <w:instrText xml:space="preserve"> PAGEREF _Toc241409250 \h </w:instrText>
       </w:r>
       <w:r>
         <w:rPr>
@@ -1185,7 +1185,7 @@
         <w:rPr>
           <w:noProof/>
         </w:rPr>
-        <w:t>Anwendungsfall 13: Abschluss eines Fertigungsauftrags durch den Meister</w:t>
+        <w:t>Anwendungsfall 13: Anzeige der Auftragsübersicht für alle Rollen</w:t>
       </w:r>
       <w:r>
         <w:rPr>
@@ -1203,7 +1203,7 @@
         <w:rPr>
           <w:noProof/>
         </w:rPr>
-        <w:instrText xml:space="preserve"> PAGEREF _Toc241407948 \h </w:instrText>
+        <w:instrText xml:space="preserve"> PAGEREF _Toc241409251 \h </w:instrText>
       </w:r>
       <w:r>
         <w:rPr>
@@ -1246,7 +1246,7 @@
         <w:rPr>
           <w:noProof/>
         </w:rPr>
-        <w:t>Anwendungsfall 14: Nachkalkulation eines Auftrags durch das Controlling</w:t>
+        <w:t>Anwendungsfall 14: Abschluss eines Fertigungsauftrags durch den Meister</w:t>
       </w:r>
       <w:r>
         <w:rPr>
@@ -1264,7 +1264,7 @@
         <w:rPr>
           <w:noProof/>
         </w:rPr>
-        <w:instrText xml:space="preserve"> PAGEREF _Toc241407949 \h </w:instrText>
+        <w:instrText xml:space="preserve"> PAGEREF _Toc241409252 \h </w:instrText>
       </w:r>
       <w:r>
         <w:rPr>
@@ -1307,7 +1307,7 @@
         <w:rPr>
           <w:noProof/>
         </w:rPr>
-        <w:t>Anwendungsfall 15: Auswertung über mehrere Aufträge durch das Controlling</w:t>
+        <w:t>Anwendungsfall 15: Erstellung und Freigabe eines Werkszertifikats durch den Meister</w:t>
       </w:r>
       <w:r>
         <w:rPr>
@@ -1325,7 +1325,7 @@
         <w:rPr>
           <w:noProof/>
         </w:rPr>
-        <w:instrText xml:space="preserve"> PAGEREF _Toc241407950 \h </w:instrText>
+        <w:instrText xml:space="preserve"> PAGEREF _Toc241409253 \h </w:instrText>
       </w:r>
       <w:r>
         <w:rPr>
@@ -1368,7 +1368,7 @@
         <w:rPr>
           <w:noProof/>
         </w:rPr>
-        <w:t>Anwendungsfall 16: Benutzerverwaltung durch den Administrator</w:t>
+        <w:t>Anwendungsfall 16: Nachkalkulation eines Auftrags durch das Controlling</w:t>
       </w:r>
       <w:r>
         <w:rPr>
@@ -1386,7 +1386,7 @@
         <w:rPr>
           <w:noProof/>
         </w:rPr>
-        <w:instrText xml:space="preserve"> PAGEREF _Toc241407951 \h </w:instrText>
+        <w:instrText xml:space="preserve"> PAGEREF _Toc241409254 \h </w:instrText>
       </w:r>
       <w:r>
         <w:rPr>
@@ -1404,6 +1404,128 @@
           <w:noProof/>
         </w:rPr>
         <w:t>7</w:t>
+      </w:r>
+      <w:r>
+        <w:rPr>
+          <w:noProof/>
+        </w:rPr>
+        <w:fldChar w:fldCharType="end"/>
+      </w:r>
+    </w:p>
+    <w:p>
+      <w:pPr>
+        <w:pStyle w:val="Verzeichnis2"/>
+        <w:tabs>
+          <w:tab w:val="right" w:leader="dot" w:pos="9063"/>
+        </w:tabs>
+        <w:rPr>
+          <w:rFonts w:asciiTheme="minorHAnsi" w:eastAsiaTheme="minorEastAsia" w:hAnsiTheme="minorHAnsi"/>
+          <w:noProof/>
+          <w:sz w:val="24"/>
+          <w:lang w:eastAsia="de-DE"/>
+        </w:rPr>
+      </w:pPr>
+      <w:r>
+        <w:rPr>
+          <w:noProof/>
+        </w:rPr>
+        <w:t>Anwendungsfall 17: Auswertung über mehrere Aufträge durch das Controlling</w:t>
+      </w:r>
+      <w:r>
+        <w:rPr>
+          <w:noProof/>
+        </w:rPr>
+        <w:tab/>
+      </w:r>
+      <w:r>
+        <w:rPr>
+          <w:noProof/>
+        </w:rPr>
+        <w:fldChar w:fldCharType="begin"/>
+      </w:r>
+      <w:r>
+        <w:rPr>
+          <w:noProof/>
+        </w:rPr>
+        <w:instrText xml:space="preserve"> PAGEREF _Toc241409255 \h </w:instrText>
+      </w:r>
+      <w:r>
+        <w:rPr>
+          <w:noProof/>
+        </w:rPr>
+      </w:r>
+      <w:r>
+        <w:rPr>
+          <w:noProof/>
+        </w:rPr>
+        <w:fldChar w:fldCharType="separate"/>
+      </w:r>
+      <w:r>
+        <w:rPr>
+          <w:noProof/>
+        </w:rPr>
+        <w:t>7</w:t>
+      </w:r>
+      <w:r>
+        <w:rPr>
+          <w:noProof/>
+        </w:rPr>
+        <w:fldChar w:fldCharType="end"/>
+      </w:r>
+    </w:p>
+    <w:p>
+      <w:pPr>
+        <w:pStyle w:val="Verzeichnis2"/>
+        <w:tabs>
+          <w:tab w:val="right" w:leader="dot" w:pos="9063"/>
+        </w:tabs>
+        <w:rPr>
+          <w:rFonts w:asciiTheme="minorHAnsi" w:eastAsiaTheme="minorEastAsia" w:hAnsiTheme="minorHAnsi"/>
+          <w:noProof/>
+          <w:sz w:val="24"/>
+          <w:lang w:eastAsia="de-DE"/>
+        </w:rPr>
+      </w:pPr>
+      <w:r>
+        <w:rPr>
+          <w:noProof/>
+        </w:rPr>
+        <w:t>Anwendungsfall 18: Benutzerverwaltung durch den Administrator</w:t>
+      </w:r>
+      <w:r>
+        <w:rPr>
+          <w:noProof/>
+        </w:rPr>
+        <w:tab/>
+      </w:r>
+      <w:r>
+        <w:rPr>
+          <w:noProof/>
+        </w:rPr>
+        <w:fldChar w:fldCharType="begin"/>
+      </w:r>
+      <w:r>
+        <w:rPr>
+          <w:noProof/>
+        </w:rPr>
+        <w:instrText xml:space="preserve"> PAGEREF _Toc241409256 \h </w:instrText>
+      </w:r>
+      <w:r>
+        <w:rPr>
+          <w:noProof/>
+        </w:rPr>
+      </w:r>
+      <w:r>
+        <w:rPr>
+          <w:noProof/>
+        </w:rPr>
+        <w:fldChar w:fldCharType="separate"/>
+      </w:r>
+      <w:r>
+        <w:rPr>
+          <w:noProof/>
+        </w:rPr>
+        <w:t>8</w:t>
       </w:r>
       <w:r>
         <w:rPr>
@@ -1447,7 +1569,7 @@
         <w:rPr>
           <w:noProof/>
         </w:rPr>
-        <w:instrText xml:space="preserve"> PAGEREF _Toc241407952 \h </w:instrText>
+        <w:instrText xml:space="preserve"> PAGEREF _Toc241409257 \h </w:instrText>
       </w:r>
       <w:r>
         <w:rPr>
@@ -1464,7 +1586,7 @@
         <w:rPr>
           <w:noProof/>
         </w:rPr>
-        <w:t>8</w:t>
+        <w:t>9</w:t>
       </w:r>
       <w:r>
         <w:rPr>
@@ -1483,7 +1605,7 @@
         <w:pStyle w:val="berschrift1"/>
         <w:pageBreakBefore/>
       </w:pPr>
-      <w:bookmarkStart w:id="0" w:name="_Toc241407930"/>
+      <w:bookmarkStart w:id="0" w:name="_Toc241409233"/>
       <w:r>
         <w:lastRenderedPageBreak/>
         <w:t>Überblick</w:t>
@@ -1503,7 +1625,7 @@
         <w:keepNext/>
       </w:pPr>
       <w:r>
-        <w:t>Es ist eine Software zu implementieren, die abdeckt, was während und nach der Produktion passiert. Werker buchen ihre Zeiten direkt am Arbeitsgang, Meister sehen in einer Hallenansicht den Stand jedes Arbeitsplatzes, und am Ende stehen ein Soll-Ist-Vergleich und die Kosten des Auftrags. Aus den Ist-Zeiten abgeschlossener Aufträge schlägt die Software genauere Soll-Zeiten für die Arbeitspläne vor.</w:t>
+        <w:t>Es ist eine Software zu implementieren, die abdeckt, was während und nach der Produktion passiert. Werker buchen ihre Zeiten direkt am Arbeitsgang und arbeiten dort Checklisten ab. Meister sehen in einer Hallenansicht den Stand jedes Arbeitsplatzes. Am Ende stehen ein Soll-Ist-Vergleich, die Kosten des Auftrags und ein Werkszertifikat für den Kunden, das aus den Daten der Checklisten entsteht. Aus den Ist-Zeiten abgeschlossener Aufträge schlägt die Software genauere Soll-Zeiten für die Arbeitspläne vor.</w:t>
       </w:r>
     </w:p>
     <w:p>
@@ -1518,7 +1640,7 @@
       <w:pPr>
         <w:pStyle w:val="berschrift1"/>
       </w:pPr>
-      <w:bookmarkStart w:id="1" w:name="_Toc241407931"/>
+      <w:bookmarkStart w:id="1" w:name="_Toc241409234"/>
       <w:r>
         <w:t>Prozesse</w:t>
       </w:r>
@@ -1528,9 +1650,9 @@
       <w:pPr>
         <w:pStyle w:val="berschrift2"/>
       </w:pPr>
-      <w:bookmarkStart w:id="2" w:name="_Toc241407932"/>
-      <w:r>
-        <w:t>Stammdaten pflegen</w:t>
+      <w:bookmarkStart w:id="2" w:name="_Toc241409235"/>
+      <w:r>
+        <w:t>Fertigungsauftrag abwickeln</w:t>
       </w:r>
       <w:bookmarkEnd w:id="2"/>
     </w:p>
@@ -1540,10 +1662,10 @@
           <w:noProof/>
         </w:rPr>
         <w:drawing>
-          <wp:inline distT="0" distB="0" distL="0" distR="0" wp14:anchorId="16361AC3" wp14:editId="11E3BC3D">
-            <wp:extent cx="5760000" cy="1815673"/>
-            <wp:effectExtent l="0" t="0" r="0" b="0"/>
-            <wp:docPr id="1360565768" name="Grafik 1"/>
+          <wp:inline distT="0" distB="0" distL="0" distR="0" wp14:anchorId="27A22C57" wp14:editId="65150830">
+            <wp:extent cx="5760000" cy="4508075"/>
+            <wp:effectExtent l="0" t="0" r="0" b="6985"/>
+            <wp:docPr id="1089674069" name="Grafik 1"/>
             <wp:cNvGraphicFramePr>
               <a:graphicFrameLocks xmlns:a="http://schemas.openxmlformats.org/drawingml/2006/main" noChangeAspect="1"/>
             </wp:cNvGraphicFramePr>
@@ -1551,70 +1673,11 @@
               <a:graphicData uri="http://schemas.openxmlformats.org/drawingml/2006/picture">
                 <pic:pic xmlns:pic="http://schemas.openxmlformats.org/drawingml/2006/picture">
                   <pic:nvPicPr>
-                    <pic:cNvPr id="1360565768" name=""/>
+                    <pic:cNvPr id="1089674069" name=""/>
                     <pic:cNvPicPr/>
                   </pic:nvPicPr>
                   <pic:blipFill>
                     <a:blip r:embed="rId7" cstate="print">
-                      <a:extLst>
-                        <a:ext uri="{28A0092B-C50C-407E-A947-70E740481C1C}">
-                          <a14:useLocalDpi xmlns:a14="http://schemas.microsoft.com/office/drawing/2010/main" val="0"/>
-                        </a:ext>
-                      </a:extLst>
-                    </a:blip>
-                    <a:stretch>
-                      <a:fillRect/>
-                    </a:stretch>
-                  </pic:blipFill>
-                  <pic:spPr>
-                    <a:xfrm>
-                      <a:off x="0" y="0"/>
-                      <a:ext cx="5760000" cy="1815673"/>
-                    </a:xfrm>
-                    <a:prstGeom prst="rect">
-                      <a:avLst/>
-                    </a:prstGeom>
-                  </pic:spPr>
-                </pic:pic>
-              </a:graphicData>
-            </a:graphic>
-          </wp:inline>
-        </w:drawing>
-      </w:r>
-    </w:p>
-    <w:p>
-      <w:pPr>
-        <w:pStyle w:val="berschrift2"/>
-      </w:pPr>
-      <w:bookmarkStart w:id="3" w:name="_Toc241407933"/>
-      <w:r>
-        <w:lastRenderedPageBreak/>
-        <w:t>Fertigungsauftrag abwickeln</w:t>
-      </w:r>
-      <w:bookmarkEnd w:id="3"/>
-    </w:p>
-    <w:p>
-      <w:r>
-        <w:rPr>
-          <w:noProof/>
-        </w:rPr>
-        <w:drawing>
-          <wp:inline distT="0" distB="0" distL="0" distR="0" wp14:anchorId="26EEA300" wp14:editId="651FC055">
-            <wp:extent cx="5760000" cy="4508075"/>
-            <wp:effectExtent l="0" t="0" r="0" b="6985"/>
-            <wp:docPr id="1168134569" name="Grafik 2"/>
-            <wp:cNvGraphicFramePr>
-              <a:graphicFrameLocks xmlns:a="http://schemas.openxmlformats.org/drawingml/2006/main" noChangeAspect="1"/>
-            </wp:cNvGraphicFramePr>
-            <a:graphic xmlns:a="http://schemas.openxmlformats.org/drawingml/2006/main">
-              <a:graphicData uri="http://schemas.openxmlformats.org/drawingml/2006/picture">
-                <pic:pic xmlns:pic="http://schemas.openxmlformats.org/drawingml/2006/picture">
-                  <pic:nvPicPr>
-                    <pic:cNvPr id="1168134569" name=""/>
-                    <pic:cNvPicPr/>
-                  </pic:nvPicPr>
-                  <pic:blipFill>
-                    <a:blip r:embed="rId8" cstate="print">
                       <a:extLst>
                         <a:ext uri="{28A0092B-C50C-407E-A947-70E740481C1C}">
                           <a14:useLocalDpi xmlns:a14="http://schemas.microsoft.com/office/drawing/2010/main" val="0"/>
@@ -1645,11 +1708,12 @@
       <w:pPr>
         <w:pStyle w:val="berschrift2"/>
       </w:pPr>
-      <w:bookmarkStart w:id="4" w:name="_Toc241407934"/>
-      <w:r>
-        <w:t>Arbeitspläne und Abläufe verbessern</w:t>
-      </w:r>
-      <w:bookmarkEnd w:id="4"/>
+      <w:bookmarkStart w:id="3" w:name="_Toc241409236"/>
+      <w:r>
+        <w:lastRenderedPageBreak/>
+        <w:t>Checklisten abarbeiten und Werkszertifikat erstellen</w:t>
+      </w:r>
+      <w:bookmarkEnd w:id="3"/>
     </w:p>
     <w:p>
       <w:r>
@@ -1657,10 +1721,10 @@
           <w:noProof/>
         </w:rPr>
         <w:drawing>
-          <wp:inline distT="0" distB="0" distL="0" distR="0" wp14:anchorId="4F2C874C" wp14:editId="6C8DAAF0">
-            <wp:extent cx="5760000" cy="2880317"/>
-            <wp:effectExtent l="0" t="0" r="0" b="0"/>
-            <wp:docPr id="1210473163" name="Grafik 3"/>
+          <wp:inline distT="0" distB="0" distL="0" distR="0" wp14:anchorId="22C476EC" wp14:editId="31B0C226">
+            <wp:extent cx="5760000" cy="3005383"/>
+            <wp:effectExtent l="0" t="0" r="0" b="5080"/>
+            <wp:docPr id="193349386" name="Grafik 2"/>
             <wp:cNvGraphicFramePr>
               <a:graphicFrameLocks xmlns:a="http://schemas.openxmlformats.org/drawingml/2006/main" noChangeAspect="1"/>
             </wp:cNvGraphicFramePr>
@@ -1668,7 +1732,65 @@
               <a:graphicData uri="http://schemas.openxmlformats.org/drawingml/2006/picture">
                 <pic:pic xmlns:pic="http://schemas.openxmlformats.org/drawingml/2006/picture">
                   <pic:nvPicPr>
-                    <pic:cNvPr id="1210473163" name=""/>
+                    <pic:cNvPr id="193349386" name=""/>
+                    <pic:cNvPicPr/>
+                  </pic:nvPicPr>
+                  <pic:blipFill>
+                    <a:blip r:embed="rId8" cstate="print">
+                      <a:extLst>
+                        <a:ext uri="{28A0092B-C50C-407E-A947-70E740481C1C}">
+                          <a14:useLocalDpi xmlns:a14="http://schemas.microsoft.com/office/drawing/2010/main" val="0"/>
+                        </a:ext>
+                      </a:extLst>
+                    </a:blip>
+                    <a:stretch>
+                      <a:fillRect/>
+                    </a:stretch>
+                  </pic:blipFill>
+                  <pic:spPr>
+                    <a:xfrm>
+                      <a:off x="0" y="0"/>
+                      <a:ext cx="5760000" cy="3005383"/>
+                    </a:xfrm>
+                    <a:prstGeom prst="rect">
+                      <a:avLst/>
+                    </a:prstGeom>
+                  </pic:spPr>
+                </pic:pic>
+              </a:graphicData>
+            </a:graphic>
+          </wp:inline>
+        </w:drawing>
+      </w:r>
+    </w:p>
+    <w:p>
+      <w:pPr>
+        <w:pStyle w:val="berschrift2"/>
+      </w:pPr>
+      <w:bookmarkStart w:id="4" w:name="_Toc241409237"/>
+      <w:r>
+        <w:t>Arbeitspläne und Abläufe verbessern</w:t>
+      </w:r>
+      <w:bookmarkEnd w:id="4"/>
+    </w:p>
+    <w:p>
+      <w:r>
+        <w:rPr>
+          <w:noProof/>
+        </w:rPr>
+        <w:drawing>
+          <wp:inline distT="0" distB="0" distL="0" distR="0" wp14:anchorId="0B49DDA7" wp14:editId="761C2B29">
+            <wp:extent cx="5760000" cy="2880317"/>
+            <wp:effectExtent l="0" t="0" r="0" b="0"/>
+            <wp:docPr id="1923092666" name="Grafik 3"/>
+            <wp:cNvGraphicFramePr>
+              <a:graphicFrameLocks xmlns:a="http://schemas.openxmlformats.org/drawingml/2006/main" noChangeAspect="1"/>
+            </wp:cNvGraphicFramePr>
+            <a:graphic xmlns:a="http://schemas.openxmlformats.org/drawingml/2006/main">
+              <a:graphicData uri="http://schemas.openxmlformats.org/drawingml/2006/picture">
+                <pic:pic xmlns:pic="http://schemas.openxmlformats.org/drawingml/2006/picture">
+                  <pic:nvPicPr>
+                    <pic:cNvPr id="1923092666" name=""/>
                     <pic:cNvPicPr/>
                   </pic:nvPicPr>
                   <pic:blipFill>
@@ -1704,7 +1826,7 @@
         <w:pStyle w:val="berschrift1"/>
         <w:pageBreakBefore/>
       </w:pPr>
-      <w:bookmarkStart w:id="5" w:name="_Toc241407935"/>
+      <w:bookmarkStart w:id="5" w:name="_Toc241409238"/>
       <w:r>
         <w:lastRenderedPageBreak/>
         <w:t>Anwendungsfälle</w:t>
@@ -1715,7 +1837,7 @@
       <w:pPr>
         <w:pStyle w:val="berschrift2"/>
       </w:pPr>
-      <w:bookmarkStart w:id="6" w:name="_Toc241407936"/>
+      <w:bookmarkStart w:id="6" w:name="_Toc241409239"/>
       <w:r>
         <w:t>Anwendungsfall 1: Pflege von Artikeln und Arbeitsplänen durch die Arbeitsvorbereitung</w:t>
       </w:r>
@@ -1789,7 +1911,7 @@
       <w:pPr>
         <w:pStyle w:val="berschrift2"/>
       </w:pPr>
-      <w:bookmarkStart w:id="7" w:name="_Toc241407937"/>
+      <w:bookmarkStart w:id="7" w:name="_Toc241409240"/>
       <w:r>
         <w:t>Anwendungsfall 2: Übernahme von Soll-Zeit-Vorschlägen durch die Arbeitsvorbereitung</w:t>
       </w:r>
@@ -1863,7 +1985,7 @@
       <w:pPr>
         <w:pStyle w:val="berschrift2"/>
       </w:pPr>
-      <w:bookmarkStart w:id="8" w:name="_Toc241407938"/>
+      <w:bookmarkStart w:id="8" w:name="_Toc241409241"/>
       <w:r>
         <w:t>Anwendungsfall 3: Pflege von Arbeitsplätzen und Stundensätzen durch Arbeitsvorbereitung oder Controlling</w:t>
       </w:r>
@@ -1929,7 +2051,7 @@
       <w:pPr>
         <w:pStyle w:val="berschrift2"/>
       </w:pPr>
-      <w:bookmarkStart w:id="9" w:name="_Toc241407939"/>
+      <w:bookmarkStart w:id="9" w:name="_Toc241409242"/>
       <w:r>
         <w:t>Anwendungsfall 4: Anlage eines Fertigungsauftrags durch die Arbeitsvorbereitung</w:t>
       </w:r>
@@ -1996,7 +2118,7 @@
       <w:pPr>
         <w:pStyle w:val="berschrift2"/>
       </w:pPr>
-      <w:bookmarkStart w:id="10" w:name="_Toc241407940"/>
+      <w:bookmarkStart w:id="10" w:name="_Toc241409243"/>
       <w:r>
         <w:t>Anwendungsfall 5: Änderung, Freigabe oder Stornierung eines Fertigungsauftrags durch die Arbeitsvorbereitung</w:t>
       </w:r>
@@ -2070,7 +2192,7 @@
       <w:pPr>
         <w:pStyle w:val="berschrift2"/>
       </w:pPr>
-      <w:bookmarkStart w:id="11" w:name="_Toc241407941"/>
+      <w:bookmarkStart w:id="11" w:name="_Toc241409244"/>
       <w:r>
         <w:t>Anwendungsfall 6: Anzeige des Arbeitsvorrats für den Werker</w:t>
       </w:r>
@@ -2128,7 +2250,7 @@
       <w:pPr>
         <w:pStyle w:val="berschrift2"/>
       </w:pPr>
-      <w:bookmarkStart w:id="12" w:name="_Toc241407942"/>
+      <w:bookmarkStart w:id="12" w:name="_Toc241409245"/>
       <w:r>
         <w:t>Anwendungsfall 7: Start und Fortsetzung eines Arbeitsgangs durch den Werker</w:t>
       </w:r>
@@ -2194,7 +2316,7 @@
       <w:pPr>
         <w:pStyle w:val="berschrift2"/>
       </w:pPr>
-      <w:bookmarkStart w:id="13" w:name="_Toc241407943"/>
+      <w:bookmarkStart w:id="13" w:name="_Toc241409246"/>
       <w:r>
         <w:t>Anwendungsfall 8: Unterbrechung eines Arbeitsgangs mit Grund durch den Werker</w:t>
       </w:r>
@@ -2253,9 +2375,9 @@
       <w:pPr>
         <w:pStyle w:val="berschrift2"/>
       </w:pPr>
-      <w:bookmarkStart w:id="14" w:name="_Toc241407944"/>
-      <w:r>
-        <w:t>Anwendungsfall 9: Fertigmeldung eines Arbeitsgangs durch den Werker</w:t>
+      <w:bookmarkStart w:id="14" w:name="_Toc241409247"/>
+      <w:r>
+        <w:t>Anwendungsfall 9: Abarbeitung der Checkliste eines Arbeitsgangs durch den Werker</w:t>
       </w:r>
       <w:bookmarkEnd w:id="14"/>
     </w:p>
@@ -2288,6 +2410,80 @@
         <w:pStyle w:val="Aufzhlungszeichen"/>
       </w:pPr>
       <w:r>
+        <w:t>beim laufenden Arbeitsgang die zugehörige Checkliste öffnen</w:t>
+      </w:r>
+    </w:p>
+    <w:p>
+      <w:pPr>
+        <w:pStyle w:val="Aufzhlungszeichen"/>
+      </w:pPr>
+      <w:r>
+        <w:t>jeden Prüfpunkt abhaken und die geforderten Messwerte eingeben, zum Beispiel Durchmesser oder Oberflächengüte</w:t>
+      </w:r>
+    </w:p>
+    <w:p>
+      <w:pPr>
+        <w:pStyle w:val="Aufzhlungszeichen"/>
+      </w:pPr>
+      <w:r>
+        <w:t>sofort sehen, ob ein Messwert innerhalb der Toleranz liegt</w:t>
+      </w:r>
+    </w:p>
+    <w:p>
+      <w:pPr>
+        <w:pStyle w:val="Aufzhlungszeichen"/>
+      </w:pPr>
+      <w:r>
+        <w:t>bei einer Abweichung eine Bemerkung erfassen, nacharbeiten und erneut prüfen</w:t>
+      </w:r>
+    </w:p>
+    <w:p>
+      <w:pPr>
+        <w:pStyle w:val="Aufzhlungszeichen"/>
+      </w:pPr>
+      <w:r>
+        <w:t>die Checkliste abschließen. Erst danach kann ich den Arbeitsgang fertig melden, und die Daten stehen für das Werkszertifikat bereit</w:t>
+      </w:r>
+    </w:p>
+    <w:p>
+      <w:pPr>
+        <w:pStyle w:val="berschrift2"/>
+      </w:pPr>
+      <w:bookmarkStart w:id="15" w:name="_Toc241409248"/>
+      <w:r>
+        <w:t>Anwendungsfall 10: Fertigmeldung eines Arbeitsgangs durch den Werker</w:t>
+      </w:r>
+      <w:bookmarkEnd w:id="15"/>
+    </w:p>
+    <w:p>
+      <w:pPr>
+        <w:keepNext/>
+      </w:pPr>
+      <w:r>
+        <w:t>Als Werker möchte ich</w:t>
+      </w:r>
+    </w:p>
+    <w:p>
+      <w:pPr>
+        <w:pStyle w:val="Aufzhlungszeichen"/>
+      </w:pPr>
+      <w:r>
+        <w:t>mich am System anmelden</w:t>
+      </w:r>
+    </w:p>
+    <w:p>
+      <w:pPr>
+        <w:pStyle w:val="Aufzhlungszeichen"/>
+      </w:pPr>
+      <w:r>
+        <w:t>den Geschäftsvorfall „Werker-Terminal“ auswählen</w:t>
+      </w:r>
+    </w:p>
+    <w:p>
+      <w:pPr>
+        <w:pStyle w:val="Aufzhlungszeichen"/>
+      </w:pPr>
+      <w:r>
         <w:t>beim laufenden Arbeitsgang „Fertig melden“ wählen</w:t>
       </w:r>
     </w:p>
@@ -2319,11 +2515,11 @@
       <w:pPr>
         <w:pStyle w:val="berschrift2"/>
       </w:pPr>
-      <w:bookmarkStart w:id="15" w:name="_Toc241407945"/>
-      <w:r>
-        <w:t>Anwendungsfall 10: Nachtragen und Korrigieren von Buchungen durch den Meister</w:t>
-      </w:r>
-      <w:bookmarkEnd w:id="15"/>
+      <w:bookmarkStart w:id="16" w:name="_Toc241409249"/>
+      <w:r>
+        <w:t>Anwendungsfall 11: Nachtragen und Korrigieren von Buchungen durch den Meister</w:t>
+      </w:r>
+      <w:bookmarkEnd w:id="16"/>
     </w:p>
     <w:p>
       <w:pPr>
@@ -2385,11 +2581,11 @@
       <w:pPr>
         <w:pStyle w:val="berschrift2"/>
       </w:pPr>
-      <w:bookmarkStart w:id="16" w:name="_Toc241407946"/>
-      <w:r>
-        <w:t>Anwendungsfall 11: Anzeige der Hallenansicht für den Meister</w:t>
-      </w:r>
-      <w:bookmarkEnd w:id="16"/>
+      <w:bookmarkStart w:id="17" w:name="_Toc241409250"/>
+      <w:r>
+        <w:t>Anwendungsfall 12: Anzeige der Hallenansicht für den Meister</w:t>
+      </w:r>
+      <w:bookmarkEnd w:id="17"/>
     </w:p>
     <w:p>
       <w:pPr>
@@ -2467,11 +2663,12 @@
       <w:pPr>
         <w:pStyle w:val="berschrift2"/>
       </w:pPr>
-      <w:bookmarkStart w:id="17" w:name="_Toc241407947"/>
-      <w:r>
-        <w:t>Anwendungsfall 12: Anzeige der Auftragsübersicht für alle Rollen</w:t>
-      </w:r>
-      <w:bookmarkEnd w:id="17"/>
+      <w:bookmarkStart w:id="18" w:name="_Toc241409251"/>
+      <w:r>
+        <w:lastRenderedPageBreak/>
+        <w:t>Anwendungsfall 13: Anzeige der Auftragsübersicht für alle Rollen</w:t>
+      </w:r>
+      <w:bookmarkEnd w:id="18"/>
     </w:p>
     <w:p>
       <w:pPr>
@@ -2525,19 +2722,307 @@
       <w:pPr>
         <w:pStyle w:val="berschrift2"/>
       </w:pPr>
-      <w:bookmarkStart w:id="18" w:name="_Toc241407948"/>
+      <w:bookmarkStart w:id="19" w:name="_Toc241409252"/>
+      <w:r>
+        <w:t>Anwendungsfall 14: Abschluss eines Fertigungsauftrags durch den Meister</w:t>
+      </w:r>
+      <w:bookmarkEnd w:id="19"/>
+    </w:p>
+    <w:p>
+      <w:pPr>
+        <w:keepNext/>
+      </w:pPr>
+      <w:r>
+        <w:t>Als Meister möchte ich</w:t>
+      </w:r>
+    </w:p>
+    <w:p>
+      <w:pPr>
+        <w:pStyle w:val="Aufzhlungszeichen"/>
+      </w:pPr>
+      <w:r>
+        <w:t>mich am System anmelden</w:t>
+      </w:r>
+    </w:p>
+    <w:p>
+      <w:pPr>
+        <w:pStyle w:val="Aufzhlungszeichen"/>
+      </w:pPr>
+      <w:r>
+        <w:t>den Geschäftsvorfall „Aufträge“ auswählen</w:t>
+      </w:r>
+    </w:p>
+    <w:p>
+      <w:pPr>
+        <w:pStyle w:val="Aufzhlungszeichen"/>
+      </w:pPr>
+      <w:r>
+        <w:t>einen Auftrag auswählen, dessen Arbeitsgänge alle erledigt sind</w:t>
+      </w:r>
+    </w:p>
+    <w:p>
+      <w:pPr>
+        <w:pStyle w:val="Aufzhlungszeichen"/>
+      </w:pPr>
+      <w:r>
+        <w:t>die Buchungen und Mengen des Auftrags prüfen</w:t>
+      </w:r>
+    </w:p>
+    <w:p>
+      <w:pPr>
+        <w:pStyle w:val="Aufzhlungszeichen"/>
+      </w:pPr>
+      <w:r>
+        <w:t>den Auftrag abschließen. Danach sind keine Buchungen mehr möglich, und der Auftrag steht für die Nachkalkulation bereit</w:t>
+      </w:r>
+    </w:p>
+    <w:p>
+      <w:pPr>
+        <w:pStyle w:val="berschrift2"/>
+      </w:pPr>
+      <w:bookmarkStart w:id="20" w:name="_Toc241409253"/>
+      <w:r>
+        <w:t>Anwendungsfall 15: Erstellung und Freigabe eines Werkszertifikats durch den Meister</w:t>
+      </w:r>
+      <w:bookmarkEnd w:id="20"/>
+    </w:p>
+    <w:p>
+      <w:pPr>
+        <w:keepNext/>
+      </w:pPr>
+      <w:r>
+        <w:t>Als Meister möchte ich</w:t>
+      </w:r>
+    </w:p>
+    <w:p>
+      <w:pPr>
+        <w:pStyle w:val="Aufzhlungszeichen"/>
+      </w:pPr>
+      <w:r>
+        <w:t>mich am System anmelden</w:t>
+      </w:r>
+    </w:p>
+    <w:p>
+      <w:pPr>
+        <w:pStyle w:val="Aufzhlungszeichen"/>
+      </w:pPr>
+      <w:r>
+        <w:t>den Geschäftsvorfall „Aufträge“ auswählen und einen fertigen Auftrag öffnen</w:t>
+      </w:r>
+    </w:p>
+    <w:p>
+      <w:pPr>
+        <w:pStyle w:val="Aufzhlungszeichen"/>
+      </w:pPr>
+      <w:r>
+        <w:t>die Checklisten und Messwerte aller Arbeitsgänge des Auftrags sehen</w:t>
+      </w:r>
+    </w:p>
+    <w:p>
+      <w:pPr>
+        <w:pStyle w:val="Aufzhlungszeichen"/>
+      </w:pPr>
+      <w:r>
+        <w:t>prüfen, ob alle Prüfpunkte erledigt sind und alle Messwerte in der Toleranz liegen</w:t>
+      </w:r>
+    </w:p>
+    <w:p>
+      <w:pPr>
+        <w:pStyle w:val="Aufzhlungszeichen"/>
+      </w:pPr>
+      <w:r>
+        <w:t>aus diesen Daten ein Werkszertifikat mit Auftrag, Artikel, Menge und Prüfergebnissen erzeugen, zum Beispiel ein Werkszeugnis 2.2 nach DIN EN 10204</w:t>
+      </w:r>
+    </w:p>
+    <w:p>
+      <w:pPr>
+        <w:pStyle w:val="Aufzhlungszeichen"/>
+      </w:pPr>
+      <w:r>
+        <w:t>das Werkszertifikat freigeben und als PDF für den Kunden ablegen</w:t>
+      </w:r>
+    </w:p>
+    <w:p>
+      <w:pPr>
+        <w:pStyle w:val="berschrift2"/>
+      </w:pPr>
+      <w:bookmarkStart w:id="21" w:name="_Toc241409254"/>
+      <w:r>
+        <w:t>Anwendungsfall 16: Nachkalkulation eines Auftrags durch das Controlling</w:t>
+      </w:r>
+      <w:bookmarkEnd w:id="21"/>
+    </w:p>
+    <w:p>
+      <w:pPr>
+        <w:keepNext/>
+      </w:pPr>
+      <w:r>
+        <w:t>Als Controller möchte ich</w:t>
+      </w:r>
+    </w:p>
+    <w:p>
+      <w:pPr>
+        <w:pStyle w:val="Aufzhlungszeichen"/>
+      </w:pPr>
+      <w:r>
+        <w:t>mich am System anmelden</w:t>
+      </w:r>
+    </w:p>
+    <w:p>
+      <w:pPr>
+        <w:pStyle w:val="Aufzhlungszeichen"/>
+      </w:pPr>
+      <w:r>
+        <w:t>den Geschäftsvorfall „Nachkalkulation“ auswählen</w:t>
+      </w:r>
+    </w:p>
+    <w:p>
+      <w:pPr>
+        <w:pStyle w:val="Aufzhlungszeichen"/>
+      </w:pPr>
+      <w:r>
+        <w:t>einen fertigen Auftrag auswählen</w:t>
+      </w:r>
+    </w:p>
+    <w:p>
+      <w:pPr>
+        <w:pStyle w:val="Aufzhlungszeichen"/>
+      </w:pPr>
+      <w:r>
+        <w:t>je Arbeitsgang Soll-Zeit, Ist-Zeit, Soll-Kosten und Ist-Kosten mit Abweichung sehen. Die Ampel ist grün bis +5 %, gelb bis +10 % und rot darüber</w:t>
+      </w:r>
+    </w:p>
+    <w:p>
+      <w:pPr>
+        <w:pStyle w:val="Aufzhlungszeichen"/>
+      </w:pPr>
+      <w:r>
+        <w:t>Rüst- und Bearbeitungszeiten getrennt sehen</w:t>
+      </w:r>
+    </w:p>
+    <w:p>
+      <w:pPr>
+        <w:pStyle w:val="Aufzhlungszeichen"/>
+      </w:pPr>
+      <w:r>
+        <w:t xml:space="preserve">die Kosten pro </w:t>
+      </w:r>
+      <w:proofErr w:type="spellStart"/>
+      <w:r>
+        <w:t>Gutstück</w:t>
+      </w:r>
+      <w:proofErr w:type="spellEnd"/>
+      <w:r>
+        <w:t xml:space="preserve"> sehen</w:t>
+      </w:r>
+    </w:p>
+    <w:p>
+      <w:pPr>
+        <w:pStyle w:val="Aufzhlungszeichen"/>
+      </w:pPr>
+      <w:r>
+        <w:t>die Nachkalkulation abschließen und als CSV-Datei exportieren</w:t>
+      </w:r>
+    </w:p>
+    <w:p>
+      <w:pPr>
+        <w:pStyle w:val="berschrift2"/>
+      </w:pPr>
+      <w:bookmarkStart w:id="22" w:name="_Toc241409255"/>
+      <w:r>
+        <w:t>Anwendungsfall 17: Auswertung über mehrere Aufträge durch das Controlling</w:t>
+      </w:r>
+      <w:bookmarkEnd w:id="22"/>
+    </w:p>
+    <w:p>
+      <w:pPr>
+        <w:keepNext/>
+      </w:pPr>
+      <w:r>
+        <w:t>Als Controller möchte ich</w:t>
+      </w:r>
+    </w:p>
+    <w:p>
+      <w:pPr>
+        <w:pStyle w:val="Aufzhlungszeichen"/>
+      </w:pPr>
+      <w:r>
+        <w:t>mich am System anmelden</w:t>
+      </w:r>
+    </w:p>
+    <w:p>
+      <w:pPr>
+        <w:pStyle w:val="Aufzhlungszeichen"/>
+      </w:pPr>
+      <w:r>
+        <w:t>den Geschäftsvorfall „Auswertung“ auswählen</w:t>
+      </w:r>
+    </w:p>
+    <w:p>
+      <w:pPr>
+        <w:pStyle w:val="Aufzhlungszeichen"/>
+      </w:pPr>
+      <w:r>
+        <w:t>einen Zeitraum und bei Bedarf einen Artikel auswählen</w:t>
+      </w:r>
+    </w:p>
+    <w:p>
+      <w:pPr>
+        <w:pStyle w:val="Aufzhlungszeichen"/>
+      </w:pPr>
       <w:r>
         <w:lastRenderedPageBreak/>
-        <w:t>Anwendungsfall 13: Abschluss eines Fertigungsauftrags durch den Meister</w:t>
-      </w:r>
-      <w:bookmarkEnd w:id="18"/>
+        <w:t xml:space="preserve">eine Liste aller abgeschlossenen Aufträge mit Soll-Kosten, Ist-Kosten, Abweichung und Kosten pro </w:t>
+      </w:r>
+      <w:proofErr w:type="spellStart"/>
+      <w:r>
+        <w:t>Gutstück</w:t>
+      </w:r>
+      <w:proofErr w:type="spellEnd"/>
+      <w:r>
+        <w:t xml:space="preserve"> sehen</w:t>
+      </w:r>
+    </w:p>
+    <w:p>
+      <w:pPr>
+        <w:pStyle w:val="Aufzhlungszeichen"/>
+      </w:pPr>
+      <w:r>
+        <w:t>die Zeitabweichung je Arbeitsplatz sehen</w:t>
+      </w:r>
+    </w:p>
+    <w:p>
+      <w:pPr>
+        <w:pStyle w:val="Aufzhlungszeichen"/>
+      </w:pPr>
+      <w:r>
+        <w:t>die Unterbrechungen nach Grund mit Anzahl, Dauer und Anteil sehen</w:t>
+      </w:r>
+    </w:p>
+    <w:p>
+      <w:pPr>
+        <w:pStyle w:val="Aufzhlungszeichen"/>
+      </w:pPr>
+      <w:r>
+        <w:t>die Auswertung als CSV-Datei exportieren</w:t>
+      </w:r>
+    </w:p>
+    <w:p>
+      <w:pPr>
+        <w:pStyle w:val="berschrift2"/>
+      </w:pPr>
+      <w:bookmarkStart w:id="23" w:name="_Toc241409256"/>
+      <w:r>
+        <w:t>Anwendungsfall 18: Benutzerverwaltung durch den Administrator</w:t>
+      </w:r>
+      <w:bookmarkEnd w:id="23"/>
     </w:p>
     <w:p>
       <w:pPr>
         <w:keepNext/>
       </w:pPr>
       <w:r>
-        <w:t>Als Meister möchte ich</w:t>
+        <w:t>Als Administrator möchte ich</w:t>
       </w:r>
     </w:p>
     <w:p>
@@ -2553,228 +3038,6 @@
         <w:pStyle w:val="Aufzhlungszeichen"/>
       </w:pPr>
       <w:r>
-        <w:t>den Geschäftsvorfall „Aufträge“ auswählen</w:t>
-      </w:r>
-    </w:p>
-    <w:p>
-      <w:pPr>
-        <w:pStyle w:val="Aufzhlungszeichen"/>
-      </w:pPr>
-      <w:r>
-        <w:t>einen Auftrag auswählen, dessen Arbeitsgänge alle erledigt sind</w:t>
-      </w:r>
-    </w:p>
-    <w:p>
-      <w:pPr>
-        <w:pStyle w:val="Aufzhlungszeichen"/>
-      </w:pPr>
-      <w:r>
-        <w:t>die Buchungen und Mengen des Auftrags prüfen</w:t>
-      </w:r>
-    </w:p>
-    <w:p>
-      <w:pPr>
-        <w:pStyle w:val="Aufzhlungszeichen"/>
-      </w:pPr>
-      <w:r>
-        <w:t>den Auftrag abschließen. Danach sind keine Buchungen mehr möglich, und der Auftrag steht für die Nachkalkulation bereit</w:t>
-      </w:r>
-    </w:p>
-    <w:p>
-      <w:pPr>
-        <w:pStyle w:val="berschrift2"/>
-      </w:pPr>
-      <w:bookmarkStart w:id="19" w:name="_Toc241407949"/>
-      <w:r>
-        <w:t>Anwendungsfall 14: Nachkalkulation eines Auftrags durch das Controlling</w:t>
-      </w:r>
-      <w:bookmarkEnd w:id="19"/>
-    </w:p>
-    <w:p>
-      <w:pPr>
-        <w:keepNext/>
-      </w:pPr>
-      <w:r>
-        <w:t>Als Controller möchte ich</w:t>
-      </w:r>
-    </w:p>
-    <w:p>
-      <w:pPr>
-        <w:pStyle w:val="Aufzhlungszeichen"/>
-      </w:pPr>
-      <w:r>
-        <w:t>mich am System anmelden</w:t>
-      </w:r>
-    </w:p>
-    <w:p>
-      <w:pPr>
-        <w:pStyle w:val="Aufzhlungszeichen"/>
-      </w:pPr>
-      <w:r>
-        <w:t>den Geschäftsvorfall „Nachkalkulation“ auswählen</w:t>
-      </w:r>
-    </w:p>
-    <w:p>
-      <w:pPr>
-        <w:pStyle w:val="Aufzhlungszeichen"/>
-      </w:pPr>
-      <w:r>
-        <w:t>einen fertigen Auftrag auswählen</w:t>
-      </w:r>
-    </w:p>
-    <w:p>
-      <w:pPr>
-        <w:pStyle w:val="Aufzhlungszeichen"/>
-      </w:pPr>
-      <w:r>
-        <w:t>je Arbeitsgang Soll-Zeit, Ist-Zeit, Soll-Kosten und Ist-Kosten mit Abweichung sehen. Die Ampel ist grün bis +5 %, gelb bis +10 % und rot darüber</w:t>
-      </w:r>
-    </w:p>
-    <w:p>
-      <w:pPr>
-        <w:pStyle w:val="Aufzhlungszeichen"/>
-      </w:pPr>
-      <w:r>
-        <w:t>Rüst- und Bearbeitungszeiten getrennt sehen</w:t>
-      </w:r>
-    </w:p>
-    <w:p>
-      <w:pPr>
-        <w:pStyle w:val="Aufzhlungszeichen"/>
-      </w:pPr>
-      <w:r>
-        <w:t xml:space="preserve">die Kosten pro </w:t>
-      </w:r>
-      <w:proofErr w:type="spellStart"/>
-      <w:r>
-        <w:t>Gutstück</w:t>
-      </w:r>
-      <w:proofErr w:type="spellEnd"/>
-      <w:r>
-        <w:t xml:space="preserve"> sehen</w:t>
-      </w:r>
-    </w:p>
-    <w:p>
-      <w:pPr>
-        <w:pStyle w:val="Aufzhlungszeichen"/>
-      </w:pPr>
-      <w:r>
-        <w:t>die Nachkalkulation abschließen und als CSV-Datei exportieren</w:t>
-      </w:r>
-    </w:p>
-    <w:p>
-      <w:pPr>
-        <w:pStyle w:val="berschrift2"/>
-      </w:pPr>
-      <w:bookmarkStart w:id="20" w:name="_Toc241407950"/>
-      <w:r>
-        <w:t>Anwendungsfall 15: Auswertung über mehrere Aufträge durch das Controlling</w:t>
-      </w:r>
-      <w:bookmarkEnd w:id="20"/>
-    </w:p>
-    <w:p>
-      <w:pPr>
-        <w:keepNext/>
-      </w:pPr>
-      <w:r>
-        <w:t>Als Controller möchte ich</w:t>
-      </w:r>
-    </w:p>
-    <w:p>
-      <w:pPr>
-        <w:pStyle w:val="Aufzhlungszeichen"/>
-      </w:pPr>
-      <w:r>
-        <w:t>mich am System anmelden</w:t>
-      </w:r>
-    </w:p>
-    <w:p>
-      <w:pPr>
-        <w:pStyle w:val="Aufzhlungszeichen"/>
-      </w:pPr>
-      <w:r>
-        <w:t>den Geschäftsvorfall „Auswertung“ auswählen</w:t>
-      </w:r>
-    </w:p>
-    <w:p>
-      <w:pPr>
-        <w:pStyle w:val="Aufzhlungszeichen"/>
-      </w:pPr>
-      <w:r>
-        <w:t>einen Zeitraum und bei Bedarf einen Artikel auswählen</w:t>
-      </w:r>
-    </w:p>
-    <w:p>
-      <w:pPr>
-        <w:pStyle w:val="Aufzhlungszeichen"/>
-      </w:pPr>
-      <w:r>
-        <w:t xml:space="preserve">eine Liste aller abgeschlossenen Aufträge mit Soll-Kosten, Ist-Kosten, Abweichung und Kosten pro </w:t>
-      </w:r>
-      <w:proofErr w:type="spellStart"/>
-      <w:r>
-        <w:t>Gutstück</w:t>
-      </w:r>
-      <w:proofErr w:type="spellEnd"/>
-      <w:r>
-        <w:t xml:space="preserve"> sehen</w:t>
-      </w:r>
-    </w:p>
-    <w:p>
-      <w:pPr>
-        <w:pStyle w:val="Aufzhlungszeichen"/>
-      </w:pPr>
-      <w:r>
-        <w:t>die Zeitabweichung je Arbeitsplatz sehen</w:t>
-      </w:r>
-    </w:p>
-    <w:p>
-      <w:pPr>
-        <w:pStyle w:val="Aufzhlungszeichen"/>
-      </w:pPr>
-      <w:r>
-        <w:t>die Unterbrechungen nach Grund mit Anzahl, Dauer und Anteil sehen</w:t>
-      </w:r>
-    </w:p>
-    <w:p>
-      <w:pPr>
-        <w:pStyle w:val="Aufzhlungszeichen"/>
-      </w:pPr>
-      <w:r>
-        <w:t>die Auswertung als CSV-Datei exportieren</w:t>
-      </w:r>
-    </w:p>
-    <w:p>
-      <w:pPr>
-        <w:pStyle w:val="berschrift2"/>
-      </w:pPr>
-      <w:bookmarkStart w:id="21" w:name="_Toc241407951"/>
-      <w:r>
-        <w:t>Anwendungsfall 16: Benutzerverwaltung durch den Administrator</w:t>
-      </w:r>
-      <w:bookmarkEnd w:id="21"/>
-    </w:p>
-    <w:p>
-      <w:pPr>
-        <w:keepNext/>
-      </w:pPr>
-      <w:r>
-        <w:t>Als Administrator möchte ich</w:t>
-      </w:r>
-    </w:p>
-    <w:p>
-      <w:pPr>
-        <w:pStyle w:val="Aufzhlungszeichen"/>
-      </w:pPr>
-      <w:r>
-        <w:t>mich am System anmelden</w:t>
-      </w:r>
-    </w:p>
-    <w:p>
-      <w:pPr>
-        <w:pStyle w:val="Aufzhlungszeichen"/>
-      </w:pPr>
-      <w:r>
         <w:t>den Geschäftsvorfall „Benutzer“ auswählen</w:t>
       </w:r>
     </w:p>
@@ -2791,13 +3054,7 @@
         <w:pStyle w:val="Aufzhlungszeichen"/>
       </w:pPr>
       <w:r>
-        <w:t xml:space="preserve">einen neuen Benutzer </w:t>
-      </w:r>
-      <w:r>
-        <w:t>mit Vornamen, Nachnamen,</w:t>
-      </w:r>
-      <w:r>
-        <w:t xml:space="preserve"> Personalnummer, E-Mail-Adresse, Startpasswort und Rolle anlegen. Mögliche Werte für Rolle sind „Arbeitsvorbereitung“, „Werker“, „Meister“, „Controlling“ und „Admin“</w:t>
+        <w:t>einen neuen Benutzer mit Vornamen, Nachnamen, Personalnummer, E-Mail-Adresse, Startpasswort und Rolle anlegen. Mögliche Werte für Rolle sind „Arbeitsvorbereitung“, „Werker“, „Meister“, „Controlling“ und „Admin“</w:t>
       </w:r>
     </w:p>
     <w:p>
@@ -2821,12 +3078,12 @@
         <w:pStyle w:val="berschrift1"/>
         <w:pageBreakBefore/>
       </w:pPr>
-      <w:bookmarkStart w:id="22" w:name="_Toc241407952"/>
+      <w:bookmarkStart w:id="24" w:name="_Toc241409257"/>
       <w:r>
         <w:lastRenderedPageBreak/>
         <w:t>Nicht-funktionale Anforderungen</w:t>
       </w:r>
-      <w:bookmarkEnd w:id="22"/>
+      <w:bookmarkEnd w:id="24"/>
     </w:p>
     <w:p>
       <w:pPr>
@@ -2911,13 +3168,7 @@
         <w:t xml:space="preserve">Nachvollziehbarkeit: </w:t>
       </w:r>
       <w:r>
-        <w:t xml:space="preserve">Zeitbuchungen können nicht gelöscht, sondern nur mit Begründung korrigiert werden. Jede Korrektur wird </w:t>
-      </w:r>
-      <w:r>
-        <w:t>mit Namen und</w:t>
-      </w:r>
-      <w:r>
-        <w:t xml:space="preserve"> Zeitpunkt gespeichert.</w:t>
+        <w:t>Zeitbuchungen können nicht gelöscht, sondern nur mit Begründung korrigiert werden. Jede Korrektur wird mit Namen und Zeitpunkt gespeichert. Checklisten und Messwerte eines freigegebenen Werkszertifikats können nicht mehr geändert werden.</w:t>
       </w:r>
     </w:p>
     <w:p>
@@ -3157,7 +3408,7 @@
   <w:abstractNum w:abstractNumId="0" w15:restartNumberingAfterBreak="0">
     <w:nsid w:val="FFFFFF89"/>
     <w:multiLevelType w:val="singleLevel"/>
-    <w:tmpl w:val="8BFCE65A"/>
+    <w:tmpl w:val="620E0B20"/>
     <w:lvl w:ilvl="0">
       <w:start w:val="1"/>
       <w:numFmt w:val="bullet"/>
@@ -3175,7 +3426,7 @@
       </w:rPr>
     </w:lvl>
   </w:abstractNum>
-  <w:num w:numId="1" w16cid:durableId="1612130448">
+  <w:num w:numId="1" w16cid:durableId="1094320434">
     <w:abstractNumId w:val="0"/>
   </w:num>
 </w:numbering>
@@ -3596,7 +3847,7 @@
     <w:link w:val="berschrift1Zchn"/>
     <w:uiPriority w:val="9"/>
     <w:qFormat/>
-    <w:rsid w:val="00793DE3"/>
+    <w:rsid w:val="00E4123A"/>
     <w:pPr>
       <w:keepNext/>
       <w:keepLines/>
@@ -3618,7 +3869,7 @@
     <w:uiPriority w:val="9"/>
     <w:unhideWhenUsed/>
     <w:qFormat/>
-    <w:rsid w:val="00793DE3"/>
+    <w:rsid w:val="00E4123A"/>
     <w:pPr>
       <w:keepNext/>
       <w:keepLines/>
@@ -3641,7 +3892,7 @@
     <w:semiHidden/>
     <w:unhideWhenUsed/>
     <w:qFormat/>
-    <w:rsid w:val="00793DE3"/>
+    <w:rsid w:val="00E4123A"/>
     <w:pPr>
       <w:keepNext/>
       <w:keepLines/>
@@ -3664,7 +3915,7 @@
     <w:semiHidden/>
     <w:unhideWhenUsed/>
     <w:qFormat/>
-    <w:rsid w:val="00793DE3"/>
+    <w:rsid w:val="00E4123A"/>
     <w:pPr>
       <w:keepNext/>
       <w:keepLines/>
@@ -3687,7 +3938,7 @@
     <w:semiHidden/>
     <w:unhideWhenUsed/>
     <w:qFormat/>
-    <w:rsid w:val="00793DE3"/>
+    <w:rsid w:val="00E4123A"/>
     <w:pPr>
       <w:keepNext/>
       <w:keepLines/>
@@ -3708,7 +3959,7 @@
     <w:semiHidden/>
     <w:unhideWhenUsed/>
     <w:qFormat/>
-    <w:rsid w:val="00793DE3"/>
+    <w:rsid w:val="00E4123A"/>
     <w:pPr>
       <w:keepNext/>
       <w:keepLines/>
@@ -3731,7 +3982,7 @@
     <w:semiHidden/>
     <w:unhideWhenUsed/>
     <w:qFormat/>
-    <w:rsid w:val="00793DE3"/>
+    <w:rsid w:val="00E4123A"/>
     <w:pPr>
       <w:keepNext/>
       <w:keepLines/>
@@ -3752,7 +4003,7 @@
     <w:semiHidden/>
     <w:unhideWhenUsed/>
     <w:qFormat/>
-    <w:rsid w:val="00793DE3"/>
+    <w:rsid w:val="00E4123A"/>
     <w:pPr>
       <w:keepNext/>
       <w:keepLines/>
@@ -3775,7 +4026,7 @@
     <w:semiHidden/>
     <w:unhideWhenUsed/>
     <w:qFormat/>
-    <w:rsid w:val="00793DE3"/>
+    <w:rsid w:val="00E4123A"/>
     <w:pPr>
       <w:keepNext/>
       <w:keepLines/>
@@ -3790,7 +4041,6 @@
   <w:style w:type="character" w:default="1" w:styleId="Absatz-Standardschriftart">
     <w:name w:val="Default Paragraph Font"/>
     <w:uiPriority w:val="1"/>
-    <w:semiHidden/>
     <w:unhideWhenUsed/>
   </w:style>
   <w:style w:type="table" w:default="1" w:styleId="NormaleTabelle">
@@ -3819,7 +4069,7 @@
     <w:basedOn w:val="Absatz-Standardschriftart"/>
     <w:link w:val="berschrift1"/>
     <w:uiPriority w:val="9"/>
-    <w:rsid w:val="00793DE3"/>
+    <w:rsid w:val="00E4123A"/>
     <w:rPr>
       <w:rFonts w:ascii="Calibri Light" w:eastAsiaTheme="majorEastAsia" w:hAnsi="Calibri Light" w:cs="Calibri Light"/>
       <w:color w:val="00305D"/>
@@ -3832,7 +4082,7 @@
     <w:basedOn w:val="Absatz-Standardschriftart"/>
     <w:link w:val="berschrift2"/>
     <w:uiPriority w:val="9"/>
-    <w:rsid w:val="00793DE3"/>
+    <w:rsid w:val="00E4123A"/>
     <w:rPr>
       <w:rFonts w:ascii="Calibri Light" w:eastAsiaTheme="majorEastAsia" w:hAnsi="Calibri Light" w:cs="Calibri Light"/>
       <w:color w:val="00305D"/>
@@ -3846,7 +4096,7 @@
     <w:link w:val="berschrift3"/>
     <w:uiPriority w:val="9"/>
     <w:semiHidden/>
-    <w:rsid w:val="00793DE3"/>
+    <w:rsid w:val="00E4123A"/>
     <w:rPr>
       <w:rFonts w:eastAsiaTheme="majorEastAsia" w:cstheme="majorBidi"/>
       <w:color w:val="0F4761" w:themeColor="accent1" w:themeShade="BF"/>
@@ -3860,7 +4110,7 @@
     <w:link w:val="berschrift4"/>
     <w:uiPriority w:val="9"/>
     <w:semiHidden/>
-    <w:rsid w:val="00793DE3"/>
+    <w:rsid w:val="00E4123A"/>
     <w:rPr>
       <w:rFonts w:eastAsiaTheme="majorEastAsia" w:cstheme="majorBidi"/>
       <w:i/>
@@ -3874,7 +4124,7 @@
     <w:link w:val="berschrift5"/>
     <w:uiPriority w:val="9"/>
     <w:semiHidden/>
-    <w:rsid w:val="00793DE3"/>
+    <w:rsid w:val="00E4123A"/>
     <w:rPr>
       <w:rFonts w:eastAsiaTheme="majorEastAsia" w:cstheme="majorBidi"/>
       <w:color w:val="0F4761" w:themeColor="accent1" w:themeShade="BF"/>
@@ -3886,7 +4136,7 @@
     <w:link w:val="berschrift6"/>
     <w:uiPriority w:val="9"/>
     <w:semiHidden/>
-    <w:rsid w:val="00793DE3"/>
+    <w:rsid w:val="00E4123A"/>
     <w:rPr>
       <w:rFonts w:eastAsiaTheme="majorEastAsia" w:cstheme="majorBidi"/>
       <w:i/>
@@ -3900,7 +4150,7 @@
     <w:link w:val="berschrift7"/>
     <w:uiPriority w:val="9"/>
     <w:semiHidden/>
-    <w:rsid w:val="00793DE3"/>
+    <w:rsid w:val="00E4123A"/>
     <w:rPr>
       <w:rFonts w:eastAsiaTheme="majorEastAsia" w:cstheme="majorBidi"/>
       <w:color w:val="595959" w:themeColor="text1" w:themeTint="A6"/>
@@ -3912,7 +4162,7 @@
     <w:link w:val="berschrift8"/>
     <w:uiPriority w:val="9"/>
     <w:semiHidden/>
-    <w:rsid w:val="00793DE3"/>
+    <w:rsid w:val="00E4123A"/>
     <w:rPr>
       <w:rFonts w:eastAsiaTheme="majorEastAsia" w:cstheme="majorBidi"/>
       <w:i/>
@@ -3926,7 +4176,7 @@
     <w:link w:val="berschrift9"/>
     <w:uiPriority w:val="9"/>
     <w:semiHidden/>
-    <w:rsid w:val="00793DE3"/>
+    <w:rsid w:val="00E4123A"/>
     <w:rPr>
       <w:rFonts w:eastAsiaTheme="majorEastAsia" w:cstheme="majorBidi"/>
       <w:color w:val="272727" w:themeColor="text1" w:themeTint="D8"/>
@@ -3939,7 +4189,7 @@
     <w:link w:val="TitelZchn"/>
     <w:uiPriority w:val="10"/>
     <w:qFormat/>
-    <w:rsid w:val="00793DE3"/>
+    <w:rsid w:val="00E4123A"/>
     <w:pPr>
       <w:spacing w:after="80" w:line="240" w:lineRule="auto"/>
       <w:contextualSpacing/>
@@ -3958,7 +4208,7 @@
     <w:basedOn w:val="Absatz-Standardschriftart"/>
     <w:link w:val="Titel"/>
     <w:uiPriority w:val="10"/>
-    <w:rsid w:val="00793DE3"/>
+    <w:rsid w:val="00E4123A"/>
     <w:rPr>
       <w:rFonts w:ascii="Calibri Light" w:eastAsiaTheme="majorEastAsia" w:hAnsi="Calibri Light" w:cstheme="majorBidi"/>
       <w:color w:val="00305D"/>
@@ -3975,7 +4225,7 @@
     <w:link w:val="UntertitelZchn"/>
     <w:uiPriority w:val="11"/>
     <w:qFormat/>
-    <w:rsid w:val="00793DE3"/>
+    <w:rsid w:val="00E4123A"/>
     <w:pPr>
       <w:numPr>
         <w:ilvl w:val="1"/>
@@ -3995,7 +4245,7 @@
     <w:basedOn w:val="Absatz-Standardschriftart"/>
     <w:link w:val="Untertitel"/>
     <w:uiPriority w:val="11"/>
-    <w:rsid w:val="00793DE3"/>
+    <w:rsid w:val="00E4123A"/>
     <w:rPr>
       <w:rFonts w:ascii="Verdana" w:eastAsiaTheme="majorEastAsia" w:hAnsi="Verdana" w:cstheme="majorBidi"/>
       <w:color w:val="00305D"/>
@@ -4011,7 +4261,7 @@
     <w:link w:val="ZitatZchn"/>
     <w:uiPriority w:val="29"/>
     <w:qFormat/>
-    <w:rsid w:val="00793DE3"/>
+    <w:rsid w:val="00E4123A"/>
     <w:pPr>
       <w:spacing w:before="160"/>
       <w:jc w:val="center"/>
@@ -4027,7 +4277,7 @@
     <w:basedOn w:val="Absatz-Standardschriftart"/>
     <w:link w:val="Zitat"/>
     <w:uiPriority w:val="29"/>
-    <w:rsid w:val="00793DE3"/>
+    <w:rsid w:val="00E4123A"/>
     <w:rPr>
       <w:i/>
       <w:iCs/>
@@ -4039,7 +4289,7 @@
     <w:basedOn w:val="Standard"/>
     <w:uiPriority w:val="34"/>
     <w:qFormat/>
-    <w:rsid w:val="00793DE3"/>
+    <w:rsid w:val="00E4123A"/>
     <w:pPr>
       <w:ind w:left="720"/>
       <w:contextualSpacing/>
@@ -4050,7 +4300,7 @@
     <w:basedOn w:val="Absatz-Standardschriftart"/>
     <w:uiPriority w:val="21"/>
     <w:qFormat/>
-    <w:rsid w:val="00793DE3"/>
+    <w:rsid w:val="00E4123A"/>
     <w:rPr>
       <w:i/>
       <w:iCs/>
@@ -4064,7 +4314,7 @@
     <w:link w:val="IntensivesZitatZchn"/>
     <w:uiPriority w:val="30"/>
     <w:qFormat/>
-    <w:rsid w:val="00793DE3"/>
+    <w:rsid w:val="00E4123A"/>
     <w:pPr>
       <w:pBdr>
         <w:top w:val="single" w:sz="4" w:space="10" w:color="0F4761" w:themeColor="accent1" w:themeShade="BF"/>
@@ -4085,7 +4335,7 @@
     <w:basedOn w:val="Absatz-Standardschriftart"/>
     <w:link w:val="IntensivesZitat"/>
     <w:uiPriority w:val="30"/>
-    <w:rsid w:val="00793DE3"/>
+    <w:rsid w:val="00E4123A"/>
     <w:rPr>
       <w:i/>
       <w:iCs/>
@@ -4097,7 +4347,7 @@
     <w:basedOn w:val="Absatz-Standardschriftart"/>
     <w:uiPriority w:val="32"/>
     <w:qFormat/>
-    <w:rsid w:val="00793DE3"/>
+    <w:rsid w:val="00E4123A"/>
     <w:rPr>
       <w:b/>
       <w:bCs/>
@@ -4111,7 +4361,7 @@
     <w:basedOn w:val="Standard"/>
     <w:uiPriority w:val="99"/>
     <w:unhideWhenUsed/>
-    <w:rsid w:val="00FA6D65"/>
+    <w:rsid w:val="00E4123A"/>
     <w:pPr>
       <w:numPr>
         <w:numId w:val="1"/>
@@ -4127,7 +4377,7 @@
     <w:autoRedefine/>
     <w:uiPriority w:val="39"/>
     <w:unhideWhenUsed/>
-    <w:rsid w:val="00793DE3"/>
+    <w:rsid w:val="00E4123A"/>
     <w:pPr>
       <w:spacing w:before="80" w:after="40"/>
     </w:pPr>
@@ -4139,7 +4389,7 @@
     <w:autoRedefine/>
     <w:uiPriority w:val="39"/>
     <w:unhideWhenUsed/>
-    <w:rsid w:val="00793DE3"/>
+    <w:rsid w:val="00E4123A"/>
     <w:pPr>
       <w:spacing w:after="40"/>
       <w:ind w:left="200"/>
@@ -4151,7 +4401,7 @@
     <w:link w:val="KopfzeileZchn"/>
     <w:uiPriority w:val="99"/>
     <w:unhideWhenUsed/>
-    <w:rsid w:val="00793DE3"/>
+    <w:rsid w:val="00E4123A"/>
     <w:pPr>
       <w:tabs>
         <w:tab w:val="center" w:pos="4536"/>
@@ -4165,7 +4415,7 @@
     <w:basedOn w:val="Absatz-Standardschriftart"/>
     <w:link w:val="Kopfzeile"/>
     <w:uiPriority w:val="99"/>
-    <w:rsid w:val="00793DE3"/>
+    <w:rsid w:val="00E4123A"/>
     <w:rPr>
       <w:rFonts w:ascii="Verdana" w:hAnsi="Verdana"/>
       <w:sz w:val="20"/>
@@ -4177,7 +4427,7 @@
     <w:link w:val="FuzeileZchn"/>
     <w:uiPriority w:val="99"/>
     <w:unhideWhenUsed/>
-    <w:rsid w:val="00793DE3"/>
+    <w:rsid w:val="00E4123A"/>
     <w:pPr>
       <w:tabs>
         <w:tab w:val="center" w:pos="4536"/>
@@ -4191,7 +4441,7 @@
     <w:basedOn w:val="Absatz-Standardschriftart"/>
     <w:link w:val="Fuzeile"/>
     <w:uiPriority w:val="99"/>
-    <w:rsid w:val="00793DE3"/>
+    <w:rsid w:val="00E4123A"/>
     <w:rPr>
       <w:rFonts w:ascii="Verdana" w:hAnsi="Verdana"/>
       <w:sz w:val="20"/>

</xml_diff>

<commit_message>
Fachkonzept: Auswahl von 12 Anwendungsfällen durch das Team
Das Team hat die grün markierten Anwendungsfälle ausgewählt und die Autoren eingetragen.

Co-Authored-By: Claude Opus 5.5 <noreply@anthropic.com>
</commit_message>
<xml_diff>
--- a/doku/Fachkonzept_FA-Digital.docx
+++ b/doku/Fachkonzept_FA-Digital.docx
@@ -42,10 +42,7 @@
         <w:t xml:space="preserve">Autoren: </w:t>
       </w:r>
       <w:r>
-        <w:rPr>
-          <w:highlight w:val="yellow"/>
-        </w:rPr>
-        <w:t>[Namen eintragen]</w:t>
+        <w:t>Daniel Maier, Luca Städing, Joss Wrede</w:t>
       </w:r>
     </w:p>
     <w:p>
@@ -105,7 +102,7 @@
         <w:rPr>
           <w:noProof/>
         </w:rPr>
-        <w:instrText xml:space="preserve"> PAGEREF _Toc241409233 \h </w:instrText>
+        <w:instrText xml:space="preserve"> PAGEREF _Toc241410418 \h </w:instrText>
       </w:r>
       <w:r>
         <w:rPr>
@@ -166,7 +163,7 @@
         <w:rPr>
           <w:noProof/>
         </w:rPr>
-        <w:instrText xml:space="preserve"> PAGEREF _Toc241409234 \h </w:instrText>
+        <w:instrText xml:space="preserve"> PAGEREF _Toc241410419 \h </w:instrText>
       </w:r>
       <w:r>
         <w:rPr>
@@ -227,7 +224,7 @@
         <w:rPr>
           <w:noProof/>
         </w:rPr>
-        <w:instrText xml:space="preserve"> PAGEREF _Toc241409235 \h </w:instrText>
+        <w:instrText xml:space="preserve"> PAGEREF _Toc241410420 \h </w:instrText>
       </w:r>
       <w:r>
         <w:rPr>
@@ -288,7 +285,7 @@
         <w:rPr>
           <w:noProof/>
         </w:rPr>
-        <w:instrText xml:space="preserve"> PAGEREF _Toc241409236 \h </w:instrText>
+        <w:instrText xml:space="preserve"> PAGEREF _Toc241410421 \h </w:instrText>
       </w:r>
       <w:r>
         <w:rPr>
@@ -349,7 +346,7 @@
         <w:rPr>
           <w:noProof/>
         </w:rPr>
-        <w:instrText xml:space="preserve"> PAGEREF _Toc241409237 \h </w:instrText>
+        <w:instrText xml:space="preserve"> PAGEREF _Toc241410422 \h </w:instrText>
       </w:r>
       <w:r>
         <w:rPr>
@@ -410,7 +407,7 @@
         <w:rPr>
           <w:noProof/>
         </w:rPr>
-        <w:instrText xml:space="preserve"> PAGEREF _Toc241409238 \h </w:instrText>
+        <w:instrText xml:space="preserve"> PAGEREF _Toc241410423 \h </w:instrText>
       </w:r>
       <w:r>
         <w:rPr>
@@ -453,7 +450,7 @@
         <w:rPr>
           <w:noProof/>
         </w:rPr>
-        <w:t>Anwendungsfall 1: Pflege von Artikeln und Arbeitsplänen durch die Arbeitsvorbereitung</w:t>
+        <w:t>Anwendungsfall 1: Anzeige des Arbeitsvorrats für den Werker</w:t>
       </w:r>
       <w:r>
         <w:rPr>
@@ -471,7 +468,7 @@
         <w:rPr>
           <w:noProof/>
         </w:rPr>
-        <w:instrText xml:space="preserve"> PAGEREF _Toc241409239 \h </w:instrText>
+        <w:instrText xml:space="preserve"> PAGEREF _Toc241410424 \h </w:instrText>
       </w:r>
       <w:r>
         <w:rPr>
@@ -514,7 +511,7 @@
         <w:rPr>
           <w:noProof/>
         </w:rPr>
-        <w:t>Anwendungsfall 2: Übernahme von Soll-Zeit-Vorschlägen durch die Arbeitsvorbereitung</w:t>
+        <w:t>Anwendungsfall 2: Start und Fortsetzung eines Arbeitsgangs durch den Werker</w:t>
       </w:r>
       <w:r>
         <w:rPr>
@@ -532,7 +529,7 @@
         <w:rPr>
           <w:noProof/>
         </w:rPr>
-        <w:instrText xml:space="preserve"> PAGEREF _Toc241409240 \h </w:instrText>
+        <w:instrText xml:space="preserve"> PAGEREF _Toc241410425 \h </w:instrText>
       </w:r>
       <w:r>
         <w:rPr>
@@ -575,7 +572,7 @@
         <w:rPr>
           <w:noProof/>
         </w:rPr>
-        <w:t>Anwendungsfall 3: Pflege von Arbeitsplätzen und Stundensätzen durch Arbeitsvorbereitung oder Controlling</w:t>
+        <w:t>Anwendungsfall 3: Unterbrechung eines Arbeitsgangs mit Grund durch den Werker</w:t>
       </w:r>
       <w:r>
         <w:rPr>
@@ -593,7 +590,7 @@
         <w:rPr>
           <w:noProof/>
         </w:rPr>
-        <w:instrText xml:space="preserve"> PAGEREF _Toc241409241 \h </w:instrText>
+        <w:instrText xml:space="preserve"> PAGEREF _Toc241410426 \h </w:instrText>
       </w:r>
       <w:r>
         <w:rPr>
@@ -636,7 +633,7 @@
         <w:rPr>
           <w:noProof/>
         </w:rPr>
-        <w:t>Anwendungsfall 4: Anlage eines Fertigungsauftrags durch die Arbeitsvorbereitung</w:t>
+        <w:t>Anwendungsfall 4: Abarbeitung der Checkliste eines Arbeitsgangs durch den Werker</w:t>
       </w:r>
       <w:r>
         <w:rPr>
@@ -654,7 +651,7 @@
         <w:rPr>
           <w:noProof/>
         </w:rPr>
-        <w:instrText xml:space="preserve"> PAGEREF _Toc241409242 \h </w:instrText>
+        <w:instrText xml:space="preserve"> PAGEREF _Toc241410427 \h </w:instrText>
       </w:r>
       <w:r>
         <w:rPr>
@@ -697,7 +694,7 @@
         <w:rPr>
           <w:noProof/>
         </w:rPr>
-        <w:t>Anwendungsfall 5: Änderung, Freigabe oder Stornierung eines Fertigungsauftrags durch die Arbeitsvorbereitung</w:t>
+        <w:t>Anwendungsfall 5: Fertigmeldung eines Arbeitsgangs durch den Werker</w:t>
       </w:r>
       <w:r>
         <w:rPr>
@@ -715,7 +712,7 @@
         <w:rPr>
           <w:noProof/>
         </w:rPr>
-        <w:instrText xml:space="preserve"> PAGEREF _Toc241409243 \h </w:instrText>
+        <w:instrText xml:space="preserve"> PAGEREF _Toc241410428 \h </w:instrText>
       </w:r>
       <w:r>
         <w:rPr>
@@ -758,7 +755,7 @@
         <w:rPr>
           <w:noProof/>
         </w:rPr>
-        <w:t>Anwendungsfall 6: Anzeige des Arbeitsvorrats für den Werker</w:t>
+        <w:t>Anwendungsfall 6: Nachtragen und Korrigieren von Buchungen durch den Meister</w:t>
       </w:r>
       <w:r>
         <w:rPr>
@@ -776,7 +773,7 @@
         <w:rPr>
           <w:noProof/>
         </w:rPr>
-        <w:instrText xml:space="preserve"> PAGEREF _Toc241409244 \h </w:instrText>
+        <w:instrText xml:space="preserve"> PAGEREF _Toc241410429 \h </w:instrText>
       </w:r>
       <w:r>
         <w:rPr>
@@ -819,7 +816,7 @@
         <w:rPr>
           <w:noProof/>
         </w:rPr>
-        <w:t>Anwendungsfall 7: Start und Fortsetzung eines Arbeitsgangs durch den Werker</w:t>
+        <w:t>Anwendungsfall 7: Anzeige der Hallenansicht für den Meister</w:t>
       </w:r>
       <w:r>
         <w:rPr>
@@ -837,7 +834,7 @@
         <w:rPr>
           <w:noProof/>
         </w:rPr>
-        <w:instrText xml:space="preserve"> PAGEREF _Toc241409245 \h </w:instrText>
+        <w:instrText xml:space="preserve"> PAGEREF _Toc241410430 \h </w:instrText>
       </w:r>
       <w:r>
         <w:rPr>
@@ -880,7 +877,7 @@
         <w:rPr>
           <w:noProof/>
         </w:rPr>
-        <w:t>Anwendungsfall 8: Unterbrechung eines Arbeitsgangs mit Grund durch den Werker</w:t>
+        <w:t>Anwendungsfall 8: Anzeige der Auftragsübersicht für alle Rollen</w:t>
       </w:r>
       <w:r>
         <w:rPr>
@@ -898,7 +895,7 @@
         <w:rPr>
           <w:noProof/>
         </w:rPr>
-        <w:instrText xml:space="preserve"> PAGEREF _Toc241409246 \h </w:instrText>
+        <w:instrText xml:space="preserve"> PAGEREF _Toc241410431 \h </w:instrText>
       </w:r>
       <w:r>
         <w:rPr>
@@ -941,7 +938,7 @@
         <w:rPr>
           <w:noProof/>
         </w:rPr>
-        <w:t>Anwendungsfall 9: Abarbeitung der Checkliste eines Arbeitsgangs durch den Werker</w:t>
+        <w:t>Anwendungsfall 9: Erstellung und Freigabe eines Werkszertifikats durch den Meister</w:t>
       </w:r>
       <w:r>
         <w:rPr>
@@ -959,7 +956,7 @@
         <w:rPr>
           <w:noProof/>
         </w:rPr>
-        <w:instrText xml:space="preserve"> PAGEREF _Toc241409247 \h </w:instrText>
+        <w:instrText xml:space="preserve"> PAGEREF _Toc241410432 \h </w:instrText>
       </w:r>
       <w:r>
         <w:rPr>
@@ -976,7 +973,7 @@
         <w:rPr>
           <w:noProof/>
         </w:rPr>
-        <w:t>6</w:t>
+        <w:t>5</w:t>
       </w:r>
       <w:r>
         <w:rPr>
@@ -1002,7 +999,7 @@
         <w:rPr>
           <w:noProof/>
         </w:rPr>
-        <w:t>Anwendungsfall 10: Fertigmeldung eines Arbeitsgangs durch den Werker</w:t>
+        <w:t>Anwendungsfall 10: Nachkalkulation eines Auftrags durch das Controlling</w:t>
       </w:r>
       <w:r>
         <w:rPr>
@@ -1020,7 +1017,7 @@
         <w:rPr>
           <w:noProof/>
         </w:rPr>
-        <w:instrText xml:space="preserve"> PAGEREF _Toc241409248 \h </w:instrText>
+        <w:instrText xml:space="preserve"> PAGEREF _Toc241410433 \h </w:instrText>
       </w:r>
       <w:r>
         <w:rPr>
@@ -1063,7 +1060,7 @@
         <w:rPr>
           <w:noProof/>
         </w:rPr>
-        <w:t>Anwendungsfall 11: Nachtragen und Korrigieren von Buchungen durch den Meister</w:t>
+        <w:t>Anwendungsfall 11: Auswertung über mehrere Aufträge durch das Controlling</w:t>
       </w:r>
       <w:r>
         <w:rPr>
@@ -1081,7 +1078,7 @@
         <w:rPr>
           <w:noProof/>
         </w:rPr>
-        <w:instrText xml:space="preserve"> PAGEREF _Toc241409249 \h </w:instrText>
+        <w:instrText xml:space="preserve"> PAGEREF _Toc241410434 \h </w:instrText>
       </w:r>
       <w:r>
         <w:rPr>
@@ -1124,7 +1121,7 @@
         <w:rPr>
           <w:noProof/>
         </w:rPr>
-        <w:t>Anwendungsfall 12: Anzeige der Hallenansicht für den Meister</w:t>
+        <w:t>Anwendungsfall 12: Benutzerverwaltung durch den Administrator</w:t>
       </w:r>
       <w:r>
         <w:rPr>
@@ -1142,7 +1139,7 @@
         <w:rPr>
           <w:noProof/>
         </w:rPr>
-        <w:instrText xml:space="preserve"> PAGEREF _Toc241409250 \h </w:instrText>
+        <w:instrText xml:space="preserve"> PAGEREF _Toc241410435 \h </w:instrText>
       </w:r>
       <w:r>
         <w:rPr>
@@ -1160,433 +1157,6 @@
           <w:noProof/>
         </w:rPr>
         <w:t>6</w:t>
-      </w:r>
-      <w:r>
-        <w:rPr>
-          <w:noProof/>
-        </w:rPr>
-        <w:fldChar w:fldCharType="end"/>
-      </w:r>
-    </w:p>
-    <w:p>
-      <w:pPr>
-        <w:pStyle w:val="Verzeichnis2"/>
-        <w:tabs>
-          <w:tab w:val="right" w:leader="dot" w:pos="9063"/>
-        </w:tabs>
-        <w:rPr>
-          <w:rFonts w:asciiTheme="minorHAnsi" w:eastAsiaTheme="minorEastAsia" w:hAnsiTheme="minorHAnsi"/>
-          <w:noProof/>
-          <w:sz w:val="24"/>
-          <w:lang w:eastAsia="de-DE"/>
-        </w:rPr>
-      </w:pPr>
-      <w:r>
-        <w:rPr>
-          <w:noProof/>
-        </w:rPr>
-        <w:t>Anwendungsfall 13: Anzeige der Auftragsübersicht für alle Rollen</w:t>
-      </w:r>
-      <w:r>
-        <w:rPr>
-          <w:noProof/>
-        </w:rPr>
-        <w:tab/>
-      </w:r>
-      <w:r>
-        <w:rPr>
-          <w:noProof/>
-        </w:rPr>
-        <w:fldChar w:fldCharType="begin"/>
-      </w:r>
-      <w:r>
-        <w:rPr>
-          <w:noProof/>
-        </w:rPr>
-        <w:instrText xml:space="preserve"> PAGEREF _Toc241409251 \h </w:instrText>
-      </w:r>
-      <w:r>
-        <w:rPr>
-          <w:noProof/>
-        </w:rPr>
-      </w:r>
-      <w:r>
-        <w:rPr>
-          <w:noProof/>
-        </w:rPr>
-        <w:fldChar w:fldCharType="separate"/>
-      </w:r>
-      <w:r>
-        <w:rPr>
-          <w:noProof/>
-        </w:rPr>
-        <w:t>7</w:t>
-      </w:r>
-      <w:r>
-        <w:rPr>
-          <w:noProof/>
-        </w:rPr>
-        <w:fldChar w:fldCharType="end"/>
-      </w:r>
-    </w:p>
-    <w:p>
-      <w:pPr>
-        <w:pStyle w:val="Verzeichnis2"/>
-        <w:tabs>
-          <w:tab w:val="right" w:leader="dot" w:pos="9063"/>
-        </w:tabs>
-        <w:rPr>
-          <w:rFonts w:asciiTheme="minorHAnsi" w:eastAsiaTheme="minorEastAsia" w:hAnsiTheme="minorHAnsi"/>
-          <w:noProof/>
-          <w:sz w:val="24"/>
-          <w:lang w:eastAsia="de-DE"/>
-        </w:rPr>
-      </w:pPr>
-      <w:r>
-        <w:rPr>
-          <w:noProof/>
-        </w:rPr>
-        <w:t>Anwendungsfall 14: Abschluss eines Fertigungsauftrags durch den Meister</w:t>
-      </w:r>
-      <w:r>
-        <w:rPr>
-          <w:noProof/>
-        </w:rPr>
-        <w:tab/>
-      </w:r>
-      <w:r>
-        <w:rPr>
-          <w:noProof/>
-        </w:rPr>
-        <w:fldChar w:fldCharType="begin"/>
-      </w:r>
-      <w:r>
-        <w:rPr>
-          <w:noProof/>
-        </w:rPr>
-        <w:instrText xml:space="preserve"> PAGEREF _Toc241409252 \h </w:instrText>
-      </w:r>
-      <w:r>
-        <w:rPr>
-          <w:noProof/>
-        </w:rPr>
-      </w:r>
-      <w:r>
-        <w:rPr>
-          <w:noProof/>
-        </w:rPr>
-        <w:fldChar w:fldCharType="separate"/>
-      </w:r>
-      <w:r>
-        <w:rPr>
-          <w:noProof/>
-        </w:rPr>
-        <w:t>7</w:t>
-      </w:r>
-      <w:r>
-        <w:rPr>
-          <w:noProof/>
-        </w:rPr>
-        <w:fldChar w:fldCharType="end"/>
-      </w:r>
-    </w:p>
-    <w:p>
-      <w:pPr>
-        <w:pStyle w:val="Verzeichnis2"/>
-        <w:tabs>
-          <w:tab w:val="right" w:leader="dot" w:pos="9063"/>
-        </w:tabs>
-        <w:rPr>
-          <w:rFonts w:asciiTheme="minorHAnsi" w:eastAsiaTheme="minorEastAsia" w:hAnsiTheme="minorHAnsi"/>
-          <w:noProof/>
-          <w:sz w:val="24"/>
-          <w:lang w:eastAsia="de-DE"/>
-        </w:rPr>
-      </w:pPr>
-      <w:r>
-        <w:rPr>
-          <w:noProof/>
-        </w:rPr>
-        <w:t>Anwendungsfall 15: Erstellung und Freigabe eines Werkszertifikats durch den Meister</w:t>
-      </w:r>
-      <w:r>
-        <w:rPr>
-          <w:noProof/>
-        </w:rPr>
-        <w:tab/>
-      </w:r>
-      <w:r>
-        <w:rPr>
-          <w:noProof/>
-        </w:rPr>
-        <w:fldChar w:fldCharType="begin"/>
-      </w:r>
-      <w:r>
-        <w:rPr>
-          <w:noProof/>
-        </w:rPr>
-        <w:instrText xml:space="preserve"> PAGEREF _Toc241409253 \h </w:instrText>
-      </w:r>
-      <w:r>
-        <w:rPr>
-          <w:noProof/>
-        </w:rPr>
-      </w:r>
-      <w:r>
-        <w:rPr>
-          <w:noProof/>
-        </w:rPr>
-        <w:fldChar w:fldCharType="separate"/>
-      </w:r>
-      <w:r>
-        <w:rPr>
-          <w:noProof/>
-        </w:rPr>
-        <w:t>7</w:t>
-      </w:r>
-      <w:r>
-        <w:rPr>
-          <w:noProof/>
-        </w:rPr>
-        <w:fldChar w:fldCharType="end"/>
-      </w:r>
-    </w:p>
-    <w:p>
-      <w:pPr>
-        <w:pStyle w:val="Verzeichnis2"/>
-        <w:tabs>
-          <w:tab w:val="right" w:leader="dot" w:pos="9063"/>
-        </w:tabs>
-        <w:rPr>
-          <w:rFonts w:asciiTheme="minorHAnsi" w:eastAsiaTheme="minorEastAsia" w:hAnsiTheme="minorHAnsi"/>
-          <w:noProof/>
-          <w:sz w:val="24"/>
-          <w:lang w:eastAsia="de-DE"/>
-        </w:rPr>
-      </w:pPr>
-      <w:r>
-        <w:rPr>
-          <w:noProof/>
-        </w:rPr>
-        <w:t>Anwendungsfall 16: Nachkalkulation eines Auftrags durch das Controlling</w:t>
-      </w:r>
-      <w:r>
-        <w:rPr>
-          <w:noProof/>
-        </w:rPr>
-        <w:tab/>
-      </w:r>
-      <w:r>
-        <w:rPr>
-          <w:noProof/>
-        </w:rPr>
-        <w:fldChar w:fldCharType="begin"/>
-      </w:r>
-      <w:r>
-        <w:rPr>
-          <w:noProof/>
-        </w:rPr>
-        <w:instrText xml:space="preserve"> PAGEREF _Toc241409254 \h </w:instrText>
-      </w:r>
-      <w:r>
-        <w:rPr>
-          <w:noProof/>
-        </w:rPr>
-      </w:r>
-      <w:r>
-        <w:rPr>
-          <w:noProof/>
-        </w:rPr>
-        <w:fldChar w:fldCharType="separate"/>
-      </w:r>
-      <w:r>
-        <w:rPr>
-          <w:noProof/>
-        </w:rPr>
-        <w:t>7</w:t>
-      </w:r>
-      <w:r>
-        <w:rPr>
-          <w:noProof/>
-        </w:rPr>
-        <w:fldChar w:fldCharType="end"/>
-      </w:r>
-    </w:p>
-    <w:p>
-      <w:pPr>
-        <w:pStyle w:val="Verzeichnis2"/>
-        <w:tabs>
-          <w:tab w:val="right" w:leader="dot" w:pos="9063"/>
-        </w:tabs>
-        <w:rPr>
-          <w:rFonts w:asciiTheme="minorHAnsi" w:eastAsiaTheme="minorEastAsia" w:hAnsiTheme="minorHAnsi"/>
-          <w:noProof/>
-          <w:sz w:val="24"/>
-          <w:lang w:eastAsia="de-DE"/>
-        </w:rPr>
-      </w:pPr>
-      <w:r>
-        <w:rPr>
-          <w:noProof/>
-        </w:rPr>
-        <w:t>Anwendungsfall 17: Auswertung über mehrere Aufträge durch das Controlling</w:t>
-      </w:r>
-      <w:r>
-        <w:rPr>
-          <w:noProof/>
-        </w:rPr>
-        <w:tab/>
-      </w:r>
-      <w:r>
-        <w:rPr>
-          <w:noProof/>
-        </w:rPr>
-        <w:fldChar w:fldCharType="begin"/>
-      </w:r>
-      <w:r>
-        <w:rPr>
-          <w:noProof/>
-        </w:rPr>
-        <w:instrText xml:space="preserve"> PAGEREF _Toc241409255 \h </w:instrText>
-      </w:r>
-      <w:r>
-        <w:rPr>
-          <w:noProof/>
-        </w:rPr>
-      </w:r>
-      <w:r>
-        <w:rPr>
-          <w:noProof/>
-        </w:rPr>
-        <w:fldChar w:fldCharType="separate"/>
-      </w:r>
-      <w:r>
-        <w:rPr>
-          <w:noProof/>
-        </w:rPr>
-        <w:t>7</w:t>
-      </w:r>
-      <w:r>
-        <w:rPr>
-          <w:noProof/>
-        </w:rPr>
-        <w:fldChar w:fldCharType="end"/>
-      </w:r>
-    </w:p>
-    <w:p>
-      <w:pPr>
-        <w:pStyle w:val="Verzeichnis2"/>
-        <w:tabs>
-          <w:tab w:val="right" w:leader="dot" w:pos="9063"/>
-        </w:tabs>
-        <w:rPr>
-          <w:rFonts w:asciiTheme="minorHAnsi" w:eastAsiaTheme="minorEastAsia" w:hAnsiTheme="minorHAnsi"/>
-          <w:noProof/>
-          <w:sz w:val="24"/>
-          <w:lang w:eastAsia="de-DE"/>
-        </w:rPr>
-      </w:pPr>
-      <w:r>
-        <w:rPr>
-          <w:noProof/>
-        </w:rPr>
-        <w:t>Anwendungsfall 18: Benutzerverwaltung durch den Administrator</w:t>
-      </w:r>
-      <w:r>
-        <w:rPr>
-          <w:noProof/>
-        </w:rPr>
-        <w:tab/>
-      </w:r>
-      <w:r>
-        <w:rPr>
-          <w:noProof/>
-        </w:rPr>
-        <w:fldChar w:fldCharType="begin"/>
-      </w:r>
-      <w:r>
-        <w:rPr>
-          <w:noProof/>
-        </w:rPr>
-        <w:instrText xml:space="preserve"> PAGEREF _Toc241409256 \h </w:instrText>
-      </w:r>
-      <w:r>
-        <w:rPr>
-          <w:noProof/>
-        </w:rPr>
-      </w:r>
-      <w:r>
-        <w:rPr>
-          <w:noProof/>
-        </w:rPr>
-        <w:fldChar w:fldCharType="separate"/>
-      </w:r>
-      <w:r>
-        <w:rPr>
-          <w:noProof/>
-        </w:rPr>
-        <w:t>8</w:t>
-      </w:r>
-      <w:r>
-        <w:rPr>
-          <w:noProof/>
-        </w:rPr>
-        <w:fldChar w:fldCharType="end"/>
-      </w:r>
-    </w:p>
-    <w:p>
-      <w:pPr>
-        <w:pStyle w:val="Verzeichnis1"/>
-        <w:tabs>
-          <w:tab w:val="right" w:leader="dot" w:pos="9063"/>
-        </w:tabs>
-        <w:rPr>
-          <w:rFonts w:asciiTheme="minorHAnsi" w:eastAsiaTheme="minorEastAsia" w:hAnsiTheme="minorHAnsi"/>
-          <w:noProof/>
-          <w:sz w:val="24"/>
-          <w:lang w:eastAsia="de-DE"/>
-        </w:rPr>
-      </w:pPr>
-      <w:r>
-        <w:rPr>
-          <w:noProof/>
-        </w:rPr>
-        <w:t>Nicht-funktionale Anforderungen</w:t>
-      </w:r>
-      <w:r>
-        <w:rPr>
-          <w:noProof/>
-        </w:rPr>
-        <w:tab/>
-      </w:r>
-      <w:r>
-        <w:rPr>
-          <w:noProof/>
-        </w:rPr>
-        <w:fldChar w:fldCharType="begin"/>
-      </w:r>
-      <w:r>
-        <w:rPr>
-          <w:noProof/>
-        </w:rPr>
-        <w:instrText xml:space="preserve"> PAGEREF _Toc241409257 \h </w:instrText>
-      </w:r>
-      <w:r>
-        <w:rPr>
-          <w:noProof/>
-        </w:rPr>
-      </w:r>
-      <w:r>
-        <w:rPr>
-          <w:noProof/>
-        </w:rPr>
-        <w:fldChar w:fldCharType="separate"/>
-      </w:r>
-      <w:r>
-        <w:rPr>
-          <w:noProof/>
-        </w:rPr>
-        <w:t>9</w:t>
       </w:r>
       <w:r>
         <w:rPr>
@@ -1605,7 +1175,7 @@
         <w:pStyle w:val="berschrift1"/>
         <w:pageBreakBefore/>
       </w:pPr>
-      <w:bookmarkStart w:id="0" w:name="_Toc241409233"/>
+      <w:bookmarkStart w:id="0" w:name="_Toc241410418"/>
       <w:r>
         <w:lastRenderedPageBreak/>
         <w:t>Überblick</w:t>
@@ -1640,7 +1210,7 @@
       <w:pPr>
         <w:pStyle w:val="berschrift1"/>
       </w:pPr>
-      <w:bookmarkStart w:id="1" w:name="_Toc241409234"/>
+      <w:bookmarkStart w:id="1" w:name="_Toc241410419"/>
       <w:r>
         <w:t>Prozesse</w:t>
       </w:r>
@@ -1650,7 +1220,7 @@
       <w:pPr>
         <w:pStyle w:val="berschrift2"/>
       </w:pPr>
-      <w:bookmarkStart w:id="2" w:name="_Toc241409235"/>
+      <w:bookmarkStart w:id="2" w:name="_Toc241410420"/>
       <w:r>
         <w:t>Fertigungsauftrag abwickeln</w:t>
       </w:r>
@@ -1708,7 +1278,7 @@
       <w:pPr>
         <w:pStyle w:val="berschrift2"/>
       </w:pPr>
-      <w:bookmarkStart w:id="3" w:name="_Toc241409236"/>
+      <w:bookmarkStart w:id="3" w:name="_Toc241410421"/>
       <w:r>
         <w:lastRenderedPageBreak/>
         <w:t>Checklisten abarbeiten und Werkszertifikat erstellen</w:t>
@@ -1767,7 +1337,7 @@
       <w:pPr>
         <w:pStyle w:val="berschrift2"/>
       </w:pPr>
-      <w:bookmarkStart w:id="4" w:name="_Toc241409237"/>
+      <w:bookmarkStart w:id="4" w:name="_Toc241410422"/>
       <w:r>
         <w:t>Arbeitspläne und Abläufe verbessern</w:t>
       </w:r>
@@ -1826,7 +1396,7 @@
         <w:pStyle w:val="berschrift1"/>
         <w:pageBreakBefore/>
       </w:pPr>
-      <w:bookmarkStart w:id="5" w:name="_Toc241409238"/>
+      <w:bookmarkStart w:id="5" w:name="_Toc241410423"/>
       <w:r>
         <w:lastRenderedPageBreak/>
         <w:t>Anwendungsfälle</w:t>
@@ -1837,9 +1407,15 @@
       <w:pPr>
         <w:pStyle w:val="berschrift2"/>
       </w:pPr>
-      <w:bookmarkStart w:id="6" w:name="_Toc241409239"/>
-      <w:r>
-        <w:t>Anwendungsfall 1: Pflege von Artikeln und Arbeitsplänen durch die Arbeitsvorbereitung</w:t>
+      <w:bookmarkStart w:id="6" w:name="_Toc241410424"/>
+      <w:r>
+        <w:t xml:space="preserve">Anwendungsfall </w:t>
+      </w:r>
+      <w:r>
+        <w:t>1</w:t>
+      </w:r>
+      <w:r>
+        <w:t>: Anzeige des Arbeitsvorrats für den Werker</w:t>
       </w:r>
       <w:bookmarkEnd w:id="6"/>
     </w:p>
@@ -1848,7 +1424,7 @@
         <w:keepNext/>
       </w:pPr>
       <w:r>
-        <w:t>Als Mitarbeiter der Arbeitsvorbereitung möchte ich</w:t>
+        <w:t>Als Werker möchte ich</w:t>
       </w:r>
     </w:p>
     <w:p>
@@ -1864,56 +1440,46 @@
         <w:pStyle w:val="Aufzhlungszeichen"/>
       </w:pPr>
       <w:r>
-        <w:t>den Geschäftsvorfall „Artikel &amp; Arbeitspläne“ auswählen</w:t>
-      </w:r>
-    </w:p>
-    <w:p>
-      <w:pPr>
-        <w:pStyle w:val="Aufzhlungszeichen"/>
-      </w:pPr>
-      <w:r>
-        <w:t>eine Liste aller Artikel sehen</w:t>
-      </w:r>
-    </w:p>
-    <w:p>
-      <w:pPr>
-        <w:pStyle w:val="Aufzhlungszeichen"/>
-      </w:pPr>
-      <w:r>
-        <w:t>einen neuen Artikel mit Artikelnummer und Bezeichnung anlegen oder einen vorhandenen Artikel auswählen</w:t>
-      </w:r>
-    </w:p>
-    <w:p>
-      <w:pPr>
-        <w:pStyle w:val="Aufzhlungszeichen"/>
-      </w:pPr>
-      <w:r>
-        <w:t>für den Artikel die Arbeitsgänge mit Nummer, Bezeichnung, Arbeitsplatz, Rüstzeit und Stückzeit erfassen, ändern oder entfernen</w:t>
-      </w:r>
-    </w:p>
-    <w:p>
-      <w:pPr>
-        <w:pStyle w:val="Aufzhlungszeichen"/>
-      </w:pPr>
-      <w:r>
-        <w:t>den Artikel als aktiv oder nicht aktiv kennzeichnen</w:t>
-      </w:r>
-    </w:p>
-    <w:p>
-      <w:pPr>
-        <w:pStyle w:val="Aufzhlungszeichen"/>
-      </w:pPr>
-      <w:r>
-        <w:t>die Änderungen speichern. Sie gelten nur für Aufträge, die danach angelegt werden</w:t>
+        <w:t>den Geschäftsvorfall „Werker-Terminal“ auswählen</w:t>
+      </w:r>
+    </w:p>
+    <w:p>
+      <w:pPr>
+        <w:pStyle w:val="Aufzhlungszeichen"/>
+      </w:pPr>
+      <w:r>
+        <w:t>meinen Arbeitsplatz auswählen</w:t>
+      </w:r>
+    </w:p>
+    <w:p>
+      <w:pPr>
+        <w:pStyle w:val="Aufzhlungszeichen"/>
+      </w:pPr>
+      <w:r>
+        <w:t>eine Liste aller Arbeitsgänge freigegebener Aufträge an diesem Arbeitsplatz mit Menge, Soll-Zeit und Liefertermin sehen</w:t>
+      </w:r>
+    </w:p>
+    <w:p>
+      <w:pPr>
+        <w:pStyle w:val="Aufzhlungszeichen"/>
+      </w:pPr>
+      <w:r>
+        <w:t>erkennen, welche Arbeitsgänge bereit sind und welche noch auf ihren Vorgänger warten</w:t>
       </w:r>
     </w:p>
     <w:p>
       <w:pPr>
         <w:pStyle w:val="berschrift2"/>
       </w:pPr>
-      <w:bookmarkStart w:id="7" w:name="_Toc241409240"/>
-      <w:r>
-        <w:t>Anwendungsfall 2: Übernahme von Soll-Zeit-Vorschlägen durch die Arbeitsvorbereitung</w:t>
+      <w:bookmarkStart w:id="7" w:name="_Toc241410425"/>
+      <w:r>
+        <w:t xml:space="preserve">Anwendungsfall </w:t>
+      </w:r>
+      <w:r>
+        <w:t>2</w:t>
+      </w:r>
+      <w:r>
+        <w:t>: Start und Fortsetzung eines Arbeitsgangs durch den Werker</w:t>
       </w:r>
       <w:bookmarkEnd w:id="7"/>
     </w:p>
@@ -1922,7 +1488,7 @@
         <w:keepNext/>
       </w:pPr>
       <w:r>
-        <w:t>Als Mitarbeiter der Arbeitsvorbereitung möchte ich</w:t>
+        <w:t>Als Werker möchte ich</w:t>
       </w:r>
     </w:p>
     <w:p>
@@ -1938,56 +1504,54 @@
         <w:pStyle w:val="Aufzhlungszeichen"/>
       </w:pPr>
       <w:r>
-        <w:t>den Geschäftsvorfall „Artikel &amp; Arbeitspläne“ auswählen</w:t>
-      </w:r>
-    </w:p>
-    <w:p>
-      <w:pPr>
-        <w:pStyle w:val="Aufzhlungszeichen"/>
-      </w:pPr>
-      <w:r>
-        <w:t>in der Liste sehen, für welche Artikel ein Vorschlag vorliegt</w:t>
-      </w:r>
-    </w:p>
-    <w:p>
-      <w:pPr>
-        <w:pStyle w:val="Aufzhlungszeichen"/>
-      </w:pPr>
-      <w:r>
-        <w:t>einen Artikel auswählen</w:t>
-      </w:r>
-    </w:p>
-    <w:p>
-      <w:pPr>
-        <w:pStyle w:val="Aufzhlungszeichen"/>
-      </w:pPr>
-      <w:r>
-        <w:t>je Arbeitsgang die Soll-Rüstzeit und die Soll-Stückzeit neben dem Durchschnitt der Ist-Werte aus allen abgeschlossenen Aufträgen sehen</w:t>
-      </w:r>
-    </w:p>
-    <w:p>
-      <w:pPr>
-        <w:pStyle w:val="Aufzhlungszeichen"/>
-      </w:pPr>
-      <w:r>
-        <w:t>einen Vorschlag erhalten, wenn der Durchschnitt um mehr als 10 % von der Soll-Zeit abweicht</w:t>
-      </w:r>
-    </w:p>
-    <w:p>
-      <w:pPr>
-        <w:pStyle w:val="Aufzhlungszeichen"/>
-      </w:pPr>
-      <w:r>
-        <w:t>den Vorschlag mit einem Klick in den Arbeitsplan übernehmen</w:t>
+        <w:t>den Geschäftsvorfall „Werker-Terminal“ auswählen</w:t>
+      </w:r>
+    </w:p>
+    <w:p>
+      <w:pPr>
+        <w:pStyle w:val="Aufzhlungszeichen"/>
+      </w:pPr>
+      <w:r>
+        <w:t>einen bereiten oder unterbrochenen Arbeitsgang auswählen</w:t>
+      </w:r>
+    </w:p>
+    <w:p>
+      <w:pPr>
+        <w:pStyle w:val="Aufzhlungszeichen"/>
+      </w:pPr>
+      <w:r>
+        <w:t>das Rüsten oder die Bearbeitung starten oder fortsetzen. Die Zeit wird automatisch gebucht</w:t>
+      </w:r>
+    </w:p>
+    <w:p>
+      <w:pPr>
+        <w:pStyle w:val="Aufzhlungszeichen"/>
+      </w:pPr>
+      <w:r>
+        <w:t>vom Rüsten zur Bearbeitung wechseln</w:t>
+      </w:r>
+    </w:p>
+    <w:p>
+      <w:pPr>
+        <w:pStyle w:val="Aufzhlungszeichen"/>
+      </w:pPr>
+      <w:r>
+        <w:t>jederzeit sehen, wie viel der Soll-Zeit schon verbraucht ist</w:t>
       </w:r>
     </w:p>
     <w:p>
       <w:pPr>
         <w:pStyle w:val="berschrift2"/>
       </w:pPr>
-      <w:bookmarkStart w:id="8" w:name="_Toc241409241"/>
-      <w:r>
-        <w:t>Anwendungsfall 3: Pflege von Arbeitsplätzen und Stundensätzen durch Arbeitsvorbereitung oder Controlling</w:t>
+      <w:bookmarkStart w:id="8" w:name="_Toc241410426"/>
+      <w:r>
+        <w:t xml:space="preserve">Anwendungsfall </w:t>
+      </w:r>
+      <w:r>
+        <w:t>3</w:t>
+      </w:r>
+      <w:r>
+        <w:t>: Unterbrechung eines Arbeitsgangs mit Grund durch den Werker</w:t>
       </w:r>
       <w:bookmarkEnd w:id="8"/>
     </w:p>
@@ -1996,7 +1560,7 @@
         <w:keepNext/>
       </w:pPr>
       <w:r>
-        <w:t>Als Mitarbeiter der Arbeitsvorbereitung oder des Controllings möchte ich</w:t>
+        <w:t>Als Werker möchte ich</w:t>
       </w:r>
     </w:p>
     <w:p>
@@ -2012,48 +1576,46 @@
         <w:pStyle w:val="Aufzhlungszeichen"/>
       </w:pPr>
       <w:r>
-        <w:t>den Geschäftsvorfall „Arbeitsplätze“ auswählen</w:t>
-      </w:r>
-    </w:p>
-    <w:p>
-      <w:pPr>
-        <w:pStyle w:val="Aufzhlungszeichen"/>
-      </w:pPr>
-      <w:r>
-        <w:t>eine Liste aller Arbeitsplätze mit Kostenstelle, Stundensatz und Status sehen</w:t>
-      </w:r>
-    </w:p>
-    <w:p>
-      <w:pPr>
-        <w:pStyle w:val="Aufzhlungszeichen"/>
-      </w:pPr>
-      <w:r>
-        <w:t>einen neuen Arbeitsplatz mit Nummer, Bezeichnung, Kostenstelle und Stundensatz anlegen</w:t>
-      </w:r>
-    </w:p>
-    <w:p>
-      <w:pPr>
-        <w:pStyle w:val="Aufzhlungszeichen"/>
-      </w:pPr>
-      <w:r>
-        <w:t>einen vorhandenen Arbeitsplatz ändern oder als nicht aktiv kennzeichnen</w:t>
-      </w:r>
-    </w:p>
-    <w:p>
-      <w:pPr>
-        <w:pStyle w:val="Aufzhlungszeichen"/>
-      </w:pPr>
-      <w:r>
-        <w:t>die Änderungen speichern. Ein geänderter Stundensatz gilt nur für Aufträge, die danach angelegt werden</w:t>
+        <w:t>den Geschäftsvorfall „Werker-Terminal“ auswählen</w:t>
+      </w:r>
+    </w:p>
+    <w:p>
+      <w:pPr>
+        <w:pStyle w:val="Aufzhlungszeichen"/>
+      </w:pPr>
+      <w:r>
+        <w:t>beim laufenden Arbeitsgang „Unterbrechen“ wählen</w:t>
+      </w:r>
+    </w:p>
+    <w:p>
+      <w:pPr>
+        <w:pStyle w:val="Aufzhlungszeichen"/>
+      </w:pPr>
+      <w:r>
+        <w:t>einen Grund auswählen. Mögliche Werte sind: Pause, Material fehlt, Maschinenstörung, Werkzeug fehlt, Sonstiges</w:t>
+      </w:r>
+    </w:p>
+    <w:p>
+      <w:pPr>
+        <w:pStyle w:val="Aufzhlungszeichen"/>
+      </w:pPr>
+      <w:r>
+        <w:t>die Unterbrechung speichern. Ihre Dauer zählt nicht zur Ist-Zeit des Arbeitsgangs, sondern wird nach Grund ausgewertet</w:t>
       </w:r>
     </w:p>
     <w:p>
       <w:pPr>
         <w:pStyle w:val="berschrift2"/>
       </w:pPr>
-      <w:bookmarkStart w:id="9" w:name="_Toc241409242"/>
-      <w:r>
-        <w:t>Anwendungsfall 4: Anlage eines Fertigungsauftrags durch die Arbeitsvorbereitung</w:t>
+      <w:bookmarkStart w:id="9" w:name="_Toc241410427"/>
+      <w:r>
+        <w:t xml:space="preserve">Anwendungsfall </w:t>
+      </w:r>
+      <w:r>
+        <w:t>4</w:t>
+      </w:r>
+      <w:r>
+        <w:t>: Abarbeitung der Checkliste eines Arbeitsgangs durch den Werker</w:t>
       </w:r>
       <w:bookmarkEnd w:id="9"/>
     </w:p>
@@ -2062,7 +1624,7 @@
         <w:keepNext/>
       </w:pPr>
       <w:r>
-        <w:t>Als Mitarbeiter der Arbeitsvorbereitung möchte ich</w:t>
+        <w:t>Als Werker möchte ich</w:t>
       </w:r>
     </w:p>
     <w:p>
@@ -2078,58 +1640,144 @@
         <w:pStyle w:val="Aufzhlungszeichen"/>
       </w:pPr>
       <w:r>
-        <w:t>den Geschäftsvorfall „Auftrag anlegen“ auswählen</w:t>
-      </w:r>
-    </w:p>
-    <w:p>
-      <w:pPr>
-        <w:pStyle w:val="Aufzhlungszeichen"/>
-      </w:pPr>
+        <w:t>den Geschäftsvorfall „Werker-Terminal“ auswählen</w:t>
+      </w:r>
+    </w:p>
+    <w:p>
+      <w:pPr>
+        <w:pStyle w:val="Aufzhlungszeichen"/>
+      </w:pPr>
+      <w:r>
+        <w:t>beim laufenden Arbeitsgang die zugehörige Checkliste öffnen</w:t>
+      </w:r>
+    </w:p>
+    <w:p>
+      <w:pPr>
+        <w:pStyle w:val="Aufzhlungszeichen"/>
+      </w:pPr>
+      <w:r>
+        <w:t>jeden Prüfpunkt abhaken und die geforderten Messwerte eingeben, zum Beispiel Durchmesser oder Oberflächengüte</w:t>
+      </w:r>
+    </w:p>
+    <w:p>
+      <w:pPr>
+        <w:pStyle w:val="Aufzhlungszeichen"/>
+      </w:pPr>
+      <w:r>
+        <w:t>sofort sehen, ob ein Messwert innerhalb der Toleranz liegt</w:t>
+      </w:r>
+    </w:p>
+    <w:p>
+      <w:pPr>
+        <w:pStyle w:val="Aufzhlungszeichen"/>
+      </w:pPr>
+      <w:r>
+        <w:t>bei einer Abweichung eine Bemerkung erfassen, nacharbeiten und erneut prüfen</w:t>
+      </w:r>
+    </w:p>
+    <w:p>
+      <w:pPr>
+        <w:pStyle w:val="Aufzhlungszeichen"/>
+      </w:pPr>
+      <w:r>
+        <w:t>die Checkliste abschließen. Erst danach kann ich den Arbeitsgang fertig melden, und die Daten stehen für das Werkszertifikat bereit</w:t>
+      </w:r>
+    </w:p>
+    <w:p>
+      <w:pPr>
+        <w:pStyle w:val="berschrift2"/>
+      </w:pPr>
+      <w:bookmarkStart w:id="10" w:name="_Toc241410428"/>
       <w:r>
         <w:lastRenderedPageBreak/>
-        <w:t>einen aktiven Artikel auswählen und Menge, Liefertermin und Kunde angeben</w:t>
-      </w:r>
-    </w:p>
-    <w:p>
-      <w:pPr>
-        <w:pStyle w:val="Aufzhlungszeichen"/>
-      </w:pPr>
-      <w:r>
-        <w:t>eine Vorschau der Arbeitsgänge mit Soll-Zeiten (Rüstzeit + Menge × Stückzeit) und Soll-Kosten (Soll-Zeit × Stundensatz) sehen</w:t>
-      </w:r>
-    </w:p>
-    <w:p>
-      <w:pPr>
-        <w:pStyle w:val="Aufzhlungszeichen"/>
-      </w:pPr>
-      <w:r>
-        <w:t>den Auftrag speichern. Er erhält den Status „angelegt“</w:t>
-      </w:r>
-    </w:p>
-    <w:p>
-      <w:pPr>
-        <w:pStyle w:val="Aufzhlungszeichen"/>
-      </w:pPr>
-      <w:r>
-        <w:t>den Auftrag wahlweise direkt freigeben</w:t>
+        <w:t xml:space="preserve">Anwendungsfall </w:t>
+      </w:r>
+      <w:r>
+        <w:t>5</w:t>
+      </w:r>
+      <w:r>
+        <w:t>: Fertigmeldung eines Arbeitsgangs durch den Werker</w:t>
+      </w:r>
+      <w:bookmarkEnd w:id="10"/>
+    </w:p>
+    <w:p>
+      <w:pPr>
+        <w:keepNext/>
+      </w:pPr>
+      <w:r>
+        <w:t>Als Werker möchte ich</w:t>
+      </w:r>
+    </w:p>
+    <w:p>
+      <w:pPr>
+        <w:pStyle w:val="Aufzhlungszeichen"/>
+      </w:pPr>
+      <w:r>
+        <w:t>mich am System anmelden</w:t>
+      </w:r>
+    </w:p>
+    <w:p>
+      <w:pPr>
+        <w:pStyle w:val="Aufzhlungszeichen"/>
+      </w:pPr>
+      <w:r>
+        <w:t>den Geschäftsvorfall „Werker-Terminal“ auswählen</w:t>
+      </w:r>
+    </w:p>
+    <w:p>
+      <w:pPr>
+        <w:pStyle w:val="Aufzhlungszeichen"/>
+      </w:pPr>
+      <w:r>
+        <w:t>beim laufenden Arbeitsgang „Fertig melden“ wählen</w:t>
+      </w:r>
+    </w:p>
+    <w:p>
+      <w:pPr>
+        <w:pStyle w:val="Aufzhlungszeichen"/>
+      </w:pPr>
+      <w:r>
+        <w:t xml:space="preserve">die </w:t>
+      </w:r>
+      <w:proofErr w:type="spellStart"/>
+      <w:r>
+        <w:t>Gutmenge</w:t>
+      </w:r>
+      <w:proofErr w:type="spellEnd"/>
+      <w:r>
+        <w:t xml:space="preserve"> und den Ausschuss eingeben, bei Bedarf mit einer Bemerkung</w:t>
+      </w:r>
+    </w:p>
+    <w:p>
+      <w:pPr>
+        <w:pStyle w:val="Aufzhlungszeichen"/>
+      </w:pPr>
+      <w:r>
+        <w:t>die Fertigmeldung speichern. Danach ist der nächste Arbeitsgang des Auftrags bereit</w:t>
       </w:r>
     </w:p>
     <w:p>
       <w:pPr>
         <w:pStyle w:val="berschrift2"/>
       </w:pPr>
-      <w:bookmarkStart w:id="10" w:name="_Toc241409243"/>
-      <w:r>
-        <w:t>Anwendungsfall 5: Änderung, Freigabe oder Stornierung eines Fertigungsauftrags durch die Arbeitsvorbereitung</w:t>
-      </w:r>
-      <w:bookmarkEnd w:id="10"/>
+      <w:bookmarkStart w:id="11" w:name="_Toc241410429"/>
+      <w:r>
+        <w:t xml:space="preserve">Anwendungsfall </w:t>
+      </w:r>
+      <w:r>
+        <w:t>6</w:t>
+      </w:r>
+      <w:r>
+        <w:t>: Nachtragen und Korrigieren von Buchungen durch den Meister</w:t>
+      </w:r>
+      <w:bookmarkEnd w:id="11"/>
     </w:p>
     <w:p>
       <w:pPr>
         <w:keepNext/>
       </w:pPr>
       <w:r>
-        <w:t>Als Mitarbeiter der Arbeitsvorbereitung möchte ich</w:t>
+        <w:t>Als Meister möchte ich</w:t>
       </w:r>
     </w:p>
     <w:p>
@@ -2145,6 +1793,166 @@
         <w:pStyle w:val="Aufzhlungszeichen"/>
       </w:pPr>
       <w:r>
+        <w:t>den Geschäftsvorfall „Aufträge“ auswählen und einen Auftrag öffnen</w:t>
+      </w:r>
+    </w:p>
+    <w:p>
+      <w:pPr>
+        <w:pStyle w:val="Aufzhlungszeichen"/>
+      </w:pPr>
+      <w:r>
+        <w:t>alle Zeitbuchungen des Auftrags mit Mitarbeiter, Arbeitsgang, Tätigkeit, Beginn, Ende und Dauer sehen</w:t>
+      </w:r>
+    </w:p>
+    <w:p>
+      <w:pPr>
+        <w:pStyle w:val="Aufzhlungszeichen"/>
+      </w:pPr>
+      <w:r>
+        <w:t>eine vergessene Buchung nachtragen oder eine falsche Buchung korrigieren</w:t>
+      </w:r>
+    </w:p>
+    <w:p>
+      <w:pPr>
+        <w:pStyle w:val="Aufzhlungszeichen"/>
+      </w:pPr>
+      <w:r>
+        <w:t>eine Begründung angeben. Ohne Begründung wird nichts gespeichert</w:t>
+      </w:r>
+    </w:p>
+    <w:p>
+      <w:pPr>
+        <w:pStyle w:val="Aufzhlungszeichen"/>
+      </w:pPr>
+      <w:r>
+        <w:t>die Korrektur speichern. Sie wird mit meinem Namen und dem Zeitpunkt protokolliert</w:t>
+      </w:r>
+    </w:p>
+    <w:p>
+      <w:pPr>
+        <w:pStyle w:val="berschrift2"/>
+      </w:pPr>
+      <w:bookmarkStart w:id="12" w:name="_Toc241410430"/>
+      <w:r>
+        <w:t xml:space="preserve">Anwendungsfall </w:t>
+      </w:r>
+      <w:r>
+        <w:t>7</w:t>
+      </w:r>
+      <w:r>
+        <w:t>: Anzeige der Hallenansicht für den Meister</w:t>
+      </w:r>
+      <w:bookmarkEnd w:id="12"/>
+    </w:p>
+    <w:p>
+      <w:pPr>
+        <w:keepNext/>
+      </w:pPr>
+      <w:r>
+        <w:t>Als Meister möchte ich</w:t>
+      </w:r>
+    </w:p>
+    <w:p>
+      <w:pPr>
+        <w:pStyle w:val="Aufzhlungszeichen"/>
+      </w:pPr>
+      <w:r>
+        <w:t>mich am System anmelden</w:t>
+      </w:r>
+    </w:p>
+    <w:p>
+      <w:pPr>
+        <w:pStyle w:val="Aufzhlungszeichen"/>
+      </w:pPr>
+      <w:r>
+        <w:t>den Geschäftsvorfall „Hallenansicht“ auswählen</w:t>
+      </w:r>
+    </w:p>
+    <w:p>
+      <w:pPr>
+        <w:pStyle w:val="Aufzhlungszeichen"/>
+      </w:pPr>
+      <w:r>
+        <w:t>für jeden aktiven Arbeitsplatz sehen, ob er frei, belegt oder unterbrochen ist</w:t>
+      </w:r>
+    </w:p>
+    <w:p>
+      <w:pPr>
+        <w:pStyle w:val="Aufzhlungszeichen"/>
+      </w:pPr>
+      <w:r>
+        <w:t>bei belegten Arbeitsplätzen sehen, wer an welchem Auftrag und Arbeitsgang arbeitet</w:t>
+      </w:r>
+    </w:p>
+    <w:p>
+      <w:pPr>
+        <w:pStyle w:val="Aufzhlungszeichen"/>
+      </w:pPr>
+      <w:r>
+        <w:t xml:space="preserve">sehen, wie viel der Soll-Zeit verbraucht ist. Die Ampel ist grün bis 80 %, gelb bis 100 % und rot, wenn die Soll-Zeit </w:t>
+      </w:r>
+      <w:proofErr w:type="gramStart"/>
+      <w:r>
+        <w:t>überschritten</w:t>
+      </w:r>
+      <w:proofErr w:type="gramEnd"/>
+      <w:r>
+        <w:t xml:space="preserve"> ist</w:t>
+      </w:r>
+    </w:p>
+    <w:p>
+      <w:pPr>
+        <w:pStyle w:val="Aufzhlungszeichen"/>
+      </w:pPr>
+      <w:r>
+        <w:t>bei Unterbrechungen den Grund und die Dauer sehen</w:t>
+      </w:r>
+    </w:p>
+    <w:p>
+      <w:pPr>
+        <w:pStyle w:val="Aufzhlungszeichen"/>
+      </w:pPr>
+      <w:r>
+        <w:t>eine Liste mit Handlungsbedarf und den letzten Buchungen sehen</w:t>
+      </w:r>
+    </w:p>
+    <w:p>
+      <w:pPr>
+        <w:pStyle w:val="berschrift2"/>
+      </w:pPr>
+      <w:bookmarkStart w:id="13" w:name="_Toc241410431"/>
+      <w:r>
+        <w:t xml:space="preserve">Anwendungsfall </w:t>
+      </w:r>
+      <w:r>
+        <w:t>8</w:t>
+      </w:r>
+      <w:r>
+        <w:t>: Anzeige der Auftragsübersicht für alle Rollen</w:t>
+      </w:r>
+      <w:bookmarkEnd w:id="13"/>
+    </w:p>
+    <w:p>
+      <w:pPr>
+        <w:keepNext/>
+      </w:pPr>
+      <w:r>
+        <w:t>Als Mitarbeiter (jeglicher Rolle) möchte ich</w:t>
+      </w:r>
+    </w:p>
+    <w:p>
+      <w:pPr>
+        <w:pStyle w:val="Aufzhlungszeichen"/>
+      </w:pPr>
+      <w:r>
+        <w:t>mich am System anmelden</w:t>
+      </w:r>
+    </w:p>
+    <w:p>
+      <w:pPr>
+        <w:pStyle w:val="Aufzhlungszeichen"/>
+      </w:pPr>
+      <w:r>
         <w:t>den Geschäftsvorfall „Aufträge“ auswählen</w:t>
       </w:r>
     </w:p>
@@ -2153,57 +1961,47 @@
         <w:pStyle w:val="Aufzhlungszeichen"/>
       </w:pPr>
       <w:r>
-        <w:t>eine Liste aller Aufträge sehen</w:t>
-      </w:r>
-    </w:p>
-    <w:p>
-      <w:pPr>
-        <w:pStyle w:val="Aufzhlungszeichen"/>
-      </w:pPr>
-      <w:r>
-        <w:t>den Auftrag auswählen, den ich ändern, freigeben oder stornieren möchte</w:t>
-      </w:r>
-    </w:p>
-    <w:p>
-      <w:pPr>
-        <w:pStyle w:val="Aufzhlungszeichen"/>
-      </w:pPr>
-      <w:r>
-        <w:t>Menge, Liefertermin oder Kunde ändern, solange der Auftrag den Status „angelegt“ hat</w:t>
-      </w:r>
-    </w:p>
-    <w:p>
-      <w:pPr>
-        <w:pStyle w:val="Aufzhlungszeichen"/>
-      </w:pPr>
-      <w:r>
-        <w:t>den Auftrag freigeben. Seine Arbeitsgänge erscheinen dann im Arbeitsvorrat der Werker</w:t>
-      </w:r>
-    </w:p>
-    <w:p>
-      <w:pPr>
-        <w:pStyle w:val="Aufzhlungszeichen"/>
-      </w:pPr>
-      <w:r>
-        <w:t>den Auftrag stornieren, solange noch kein Arbeitsgang gestartet wurde</w:t>
+        <w:t>eine Liste aller Aufträge mit Artikel, Menge, Liefertermin, Status, Fortschritt, Soll-Zeit und Ist-Zeit sehen</w:t>
+      </w:r>
+    </w:p>
+    <w:p>
+      <w:pPr>
+        <w:pStyle w:val="Aufzhlungszeichen"/>
+      </w:pPr>
+      <w:r>
+        <w:t>die Liste nach Status filtern und nach Auftrag oder Artikel durchsuchen</w:t>
+      </w:r>
+    </w:p>
+    <w:p>
+      <w:pPr>
+        <w:pStyle w:val="Aufzhlungszeichen"/>
+      </w:pPr>
+      <w:r>
+        <w:t>Aufträge mit überschrittenem Liefertermin auf einen Blick erkennen</w:t>
       </w:r>
     </w:p>
     <w:p>
       <w:pPr>
         <w:pStyle w:val="berschrift2"/>
       </w:pPr>
-      <w:bookmarkStart w:id="11" w:name="_Toc241409244"/>
-      <w:r>
-        <w:t>Anwendungsfall 6: Anzeige des Arbeitsvorrats für den Werker</w:t>
-      </w:r>
-      <w:bookmarkEnd w:id="11"/>
+      <w:bookmarkStart w:id="14" w:name="_Toc241410432"/>
+      <w:r>
+        <w:t xml:space="preserve">Anwendungsfall </w:t>
+      </w:r>
+      <w:r>
+        <w:t>9</w:t>
+      </w:r>
+      <w:r>
+        <w:t>: Erstellung und Freigabe eines Werkszertifikats durch den Meister</w:t>
+      </w:r>
+      <w:bookmarkEnd w:id="14"/>
     </w:p>
     <w:p>
       <w:pPr>
         <w:keepNext/>
       </w:pPr>
       <w:r>
-        <w:t>Als Werker möchte ich</w:t>
+        <w:t>Als Meister möchte ich</w:t>
       </w:r>
     </w:p>
     <w:p>
@@ -2219,49 +2017,64 @@
         <w:pStyle w:val="Aufzhlungszeichen"/>
       </w:pPr>
       <w:r>
-        <w:t>den Geschäftsvorfall „Werker-Terminal“ auswählen</w:t>
-      </w:r>
-    </w:p>
-    <w:p>
-      <w:pPr>
-        <w:pStyle w:val="Aufzhlungszeichen"/>
-      </w:pPr>
-      <w:r>
-        <w:t>meinen Arbeitsplatz auswählen</w:t>
-      </w:r>
-    </w:p>
-    <w:p>
-      <w:pPr>
-        <w:pStyle w:val="Aufzhlungszeichen"/>
-      </w:pPr>
-      <w:r>
-        <w:t>eine Liste aller Arbeitsgänge freigegebener Aufträge an diesem Arbeitsplatz mit Menge, Soll-Zeit und Liefertermin sehen</w:t>
-      </w:r>
-    </w:p>
-    <w:p>
-      <w:pPr>
-        <w:pStyle w:val="Aufzhlungszeichen"/>
-      </w:pPr>
-      <w:r>
-        <w:t>erkennen, welche Arbeitsgänge bereit sind und welche noch auf ihren Vorgänger warten</w:t>
+        <w:t>den Geschäftsvorfall „Aufträge“ auswählen und einen fertigen Auftrag öffnen</w:t>
+      </w:r>
+    </w:p>
+    <w:p>
+      <w:pPr>
+        <w:pStyle w:val="Aufzhlungszeichen"/>
+      </w:pPr>
+      <w:r>
+        <w:t>die Checklisten und Messwerte aller Arbeitsgänge des Auftrags sehen</w:t>
+      </w:r>
+    </w:p>
+    <w:p>
+      <w:pPr>
+        <w:pStyle w:val="Aufzhlungszeichen"/>
+      </w:pPr>
+      <w:r>
+        <w:t>prüfen, ob alle Prüfpunkte erledigt sind und alle Messwerte in der Toleranz liegen</w:t>
+      </w:r>
+    </w:p>
+    <w:p>
+      <w:pPr>
+        <w:pStyle w:val="Aufzhlungszeichen"/>
+      </w:pPr>
+      <w:r>
+        <w:lastRenderedPageBreak/>
+        <w:t>aus diesen Daten ein Werkszertifikat mit Auftrag, Artikel, Menge und Prüfergebnissen erzeugen, zum Beispiel ein Werkszeugnis 2.2 nach DIN EN 10204</w:t>
+      </w:r>
+    </w:p>
+    <w:p>
+      <w:pPr>
+        <w:pStyle w:val="Aufzhlungszeichen"/>
+      </w:pPr>
+      <w:r>
+        <w:t>das Werkszertifikat freigeben und als PDF für den Kunden ablegen</w:t>
       </w:r>
     </w:p>
     <w:p>
       <w:pPr>
         <w:pStyle w:val="berschrift2"/>
       </w:pPr>
-      <w:bookmarkStart w:id="12" w:name="_Toc241409245"/>
-      <w:r>
-        <w:t>Anwendungsfall 7: Start und Fortsetzung eines Arbeitsgangs durch den Werker</w:t>
-      </w:r>
-      <w:bookmarkEnd w:id="12"/>
+      <w:bookmarkStart w:id="15" w:name="_Toc241410433"/>
+      <w:r>
+        <w:t xml:space="preserve">Anwendungsfall </w:t>
+      </w:r>
+      <w:r>
+        <w:t>10</w:t>
+      </w:r>
+      <w:r>
+        <w:t>: Nachkalkulation eines Auftrags durch das Controlling</w:t>
+      </w:r>
+      <w:bookmarkEnd w:id="15"/>
     </w:p>
     <w:p>
       <w:pPr>
         <w:keepNext/>
       </w:pPr>
       <w:r>
-        <w:t>Als Werker möchte ich</w:t>
+        <w:t>Als Controller möchte ich</w:t>
       </w:r>
     </w:p>
     <w:p>
@@ -2277,57 +2090,82 @@
         <w:pStyle w:val="Aufzhlungszeichen"/>
       </w:pPr>
       <w:r>
-        <w:t>den Geschäftsvorfall „Werker-Terminal“ auswählen</w:t>
-      </w:r>
-    </w:p>
-    <w:p>
-      <w:pPr>
-        <w:pStyle w:val="Aufzhlungszeichen"/>
-      </w:pPr>
-      <w:r>
-        <w:t>einen bereiten oder unterbrochenen Arbeitsgang auswählen</w:t>
-      </w:r>
-    </w:p>
-    <w:p>
-      <w:pPr>
-        <w:pStyle w:val="Aufzhlungszeichen"/>
-      </w:pPr>
-      <w:r>
-        <w:t>das Rüsten oder die Bearbeitung starten oder fortsetzen. Die Zeit wird automatisch gebucht</w:t>
-      </w:r>
-    </w:p>
-    <w:p>
-      <w:pPr>
-        <w:pStyle w:val="Aufzhlungszeichen"/>
-      </w:pPr>
-      <w:r>
-        <w:t>vom Rüsten zur Bearbeitung wechseln</w:t>
-      </w:r>
-    </w:p>
-    <w:p>
-      <w:pPr>
-        <w:pStyle w:val="Aufzhlungszeichen"/>
-      </w:pPr>
-      <w:r>
-        <w:t>jederzeit sehen, wie viel der Soll-Zeit schon verbraucht ist</w:t>
+        <w:t>den Geschäftsvorfall „Nachkalkulation“ auswählen</w:t>
+      </w:r>
+    </w:p>
+    <w:p>
+      <w:pPr>
+        <w:pStyle w:val="Aufzhlungszeichen"/>
+      </w:pPr>
+      <w:r>
+        <w:t>einen fertigen Auftrag auswählen</w:t>
+      </w:r>
+    </w:p>
+    <w:p>
+      <w:pPr>
+        <w:pStyle w:val="Aufzhlungszeichen"/>
+      </w:pPr>
+      <w:r>
+        <w:t>je Arbeitsgang Soll-Zeit, Ist-Zeit, Soll-Kosten und Ist-Kosten mit Abweichung sehen. Die Ampel ist grün bis +5 %, gelb bis +10 % und rot darüber</w:t>
+      </w:r>
+    </w:p>
+    <w:p>
+      <w:pPr>
+        <w:pStyle w:val="Aufzhlungszeichen"/>
+      </w:pPr>
+      <w:r>
+        <w:t>Rüst- und Bearbeitungszeiten getrennt sehen</w:t>
+      </w:r>
+    </w:p>
+    <w:p>
+      <w:pPr>
+        <w:pStyle w:val="Aufzhlungszeichen"/>
+      </w:pPr>
+      <w:r>
+        <w:t xml:space="preserve">die Kosten pro </w:t>
+      </w:r>
+      <w:proofErr w:type="spellStart"/>
+      <w:r>
+        <w:t>Gutstück</w:t>
+      </w:r>
+      <w:proofErr w:type="spellEnd"/>
+      <w:r>
+        <w:t xml:space="preserve"> sehen</w:t>
+      </w:r>
+    </w:p>
+    <w:p>
+      <w:pPr>
+        <w:pStyle w:val="Aufzhlungszeichen"/>
+      </w:pPr>
+      <w:r>
+        <w:t>die Nachkalkulation abschließen und als CSV-Datei exportieren</w:t>
       </w:r>
     </w:p>
     <w:p>
       <w:pPr>
         <w:pStyle w:val="berschrift2"/>
       </w:pPr>
-      <w:bookmarkStart w:id="13" w:name="_Toc241409246"/>
-      <w:r>
-        <w:t>Anwendungsfall 8: Unterbrechung eines Arbeitsgangs mit Grund durch den Werker</w:t>
-      </w:r>
-      <w:bookmarkEnd w:id="13"/>
+      <w:bookmarkStart w:id="16" w:name="_Toc241410434"/>
+      <w:r>
+        <w:t xml:space="preserve">Anwendungsfall </w:t>
+      </w:r>
+      <w:r>
+        <w:t>1</w:t>
+      </w:r>
+      <w:r>
+        <w:t>1</w:t>
+      </w:r>
+      <w:r>
+        <w:t>: Auswertung über mehrere Aufträge durch das Controlling</w:t>
+      </w:r>
+      <w:bookmarkEnd w:id="16"/>
     </w:p>
     <w:p>
       <w:pPr>
         <w:keepNext/>
       </w:pPr>
       <w:r>
-        <w:t>Als Werker möchte ich</w:t>
+        <w:t>Als Controller möchte ich</w:t>
       </w:r>
     </w:p>
     <w:p>
@@ -2343,50 +2181,82 @@
         <w:pStyle w:val="Aufzhlungszeichen"/>
       </w:pPr>
       <w:r>
-        <w:t>den Geschäftsvorfall „Werker-Terminal“ auswählen</w:t>
-      </w:r>
-    </w:p>
-    <w:p>
-      <w:pPr>
-        <w:pStyle w:val="Aufzhlungszeichen"/>
-      </w:pPr>
-      <w:r>
-        <w:t>beim laufenden Arbeitsgang „Unterbrechen“ wählen</w:t>
-      </w:r>
-    </w:p>
-    <w:p>
-      <w:pPr>
-        <w:pStyle w:val="Aufzhlungszeichen"/>
-      </w:pPr>
-      <w:r>
-        <w:lastRenderedPageBreak/>
-        <w:t>einen Grund auswählen. Mögliche Werte sind: Pause, Material fehlt, Maschinenstörung, Werkzeug fehlt, Sonstiges</w:t>
-      </w:r>
-    </w:p>
-    <w:p>
-      <w:pPr>
-        <w:pStyle w:val="Aufzhlungszeichen"/>
-      </w:pPr>
-      <w:r>
-        <w:t>die Unterbrechung speichern. Ihre Dauer zählt nicht zur Ist-Zeit des Arbeitsgangs, sondern wird nach Grund ausgewertet</w:t>
+        <w:t>den Geschäftsvorfall „Auswertung“ auswählen</w:t>
+      </w:r>
+    </w:p>
+    <w:p>
+      <w:pPr>
+        <w:pStyle w:val="Aufzhlungszeichen"/>
+      </w:pPr>
+      <w:r>
+        <w:t>einen Zeitraum und bei Bedarf einen Artikel auswählen</w:t>
+      </w:r>
+    </w:p>
+    <w:p>
+      <w:pPr>
+        <w:pStyle w:val="Aufzhlungszeichen"/>
+      </w:pPr>
+      <w:r>
+        <w:t xml:space="preserve">eine Liste aller abgeschlossenen Aufträge mit Soll-Kosten, Ist-Kosten, Abweichung und Kosten pro </w:t>
+      </w:r>
+      <w:proofErr w:type="spellStart"/>
+      <w:r>
+        <w:t>Gutstück</w:t>
+      </w:r>
+      <w:proofErr w:type="spellEnd"/>
+      <w:r>
+        <w:t xml:space="preserve"> sehen</w:t>
+      </w:r>
+    </w:p>
+    <w:p>
+      <w:pPr>
+        <w:pStyle w:val="Aufzhlungszeichen"/>
+      </w:pPr>
+      <w:r>
+        <w:t>die Zeitabweichung je Arbeitsplatz sehen</w:t>
+      </w:r>
+    </w:p>
+    <w:p>
+      <w:pPr>
+        <w:pStyle w:val="Aufzhlungszeichen"/>
+      </w:pPr>
+      <w:r>
+        <w:t>die Unterbrechungen nach Grund mit Anzahl, Dauer und Anteil sehen</w:t>
+      </w:r>
+    </w:p>
+    <w:p>
+      <w:pPr>
+        <w:pStyle w:val="Aufzhlungszeichen"/>
+      </w:pPr>
+      <w:r>
+        <w:t>die Auswertung als CSV-Datei exportieren</w:t>
       </w:r>
     </w:p>
     <w:p>
       <w:pPr>
         <w:pStyle w:val="berschrift2"/>
       </w:pPr>
-      <w:bookmarkStart w:id="14" w:name="_Toc241409247"/>
-      <w:r>
-        <w:t>Anwendungsfall 9: Abarbeitung der Checkliste eines Arbeitsgangs durch den Werker</w:t>
-      </w:r>
-      <w:bookmarkEnd w:id="14"/>
+      <w:bookmarkStart w:id="17" w:name="_Toc241410435"/>
+      <w:r>
+        <w:t xml:space="preserve">Anwendungsfall </w:t>
+      </w:r>
+      <w:r>
+        <w:t>1</w:t>
+      </w:r>
+      <w:r>
+        <w:t>2</w:t>
+      </w:r>
+      <w:r>
+        <w:t>: Benutzerverwaltung durch den Administrator</w:t>
+      </w:r>
+      <w:bookmarkEnd w:id="17"/>
     </w:p>
     <w:p>
       <w:pPr>
         <w:keepNext/>
       </w:pPr>
       <w:r>
-        <w:t>Als Werker möchte ich</w:t>
+        <w:t>Als Administrator möchte ich</w:t>
       </w:r>
     </w:p>
     <w:p>
@@ -2402,642 +2272,6 @@
         <w:pStyle w:val="Aufzhlungszeichen"/>
       </w:pPr>
       <w:r>
-        <w:t>den Geschäftsvorfall „Werker-Terminal“ auswählen</w:t>
-      </w:r>
-    </w:p>
-    <w:p>
-      <w:pPr>
-        <w:pStyle w:val="Aufzhlungszeichen"/>
-      </w:pPr>
-      <w:r>
-        <w:t>beim laufenden Arbeitsgang die zugehörige Checkliste öffnen</w:t>
-      </w:r>
-    </w:p>
-    <w:p>
-      <w:pPr>
-        <w:pStyle w:val="Aufzhlungszeichen"/>
-      </w:pPr>
-      <w:r>
-        <w:t>jeden Prüfpunkt abhaken und die geforderten Messwerte eingeben, zum Beispiel Durchmesser oder Oberflächengüte</w:t>
-      </w:r>
-    </w:p>
-    <w:p>
-      <w:pPr>
-        <w:pStyle w:val="Aufzhlungszeichen"/>
-      </w:pPr>
-      <w:r>
-        <w:t>sofort sehen, ob ein Messwert innerhalb der Toleranz liegt</w:t>
-      </w:r>
-    </w:p>
-    <w:p>
-      <w:pPr>
-        <w:pStyle w:val="Aufzhlungszeichen"/>
-      </w:pPr>
-      <w:r>
-        <w:t>bei einer Abweichung eine Bemerkung erfassen, nacharbeiten und erneut prüfen</w:t>
-      </w:r>
-    </w:p>
-    <w:p>
-      <w:pPr>
-        <w:pStyle w:val="Aufzhlungszeichen"/>
-      </w:pPr>
-      <w:r>
-        <w:t>die Checkliste abschließen. Erst danach kann ich den Arbeitsgang fertig melden, und die Daten stehen für das Werkszertifikat bereit</w:t>
-      </w:r>
-    </w:p>
-    <w:p>
-      <w:pPr>
-        <w:pStyle w:val="berschrift2"/>
-      </w:pPr>
-      <w:bookmarkStart w:id="15" w:name="_Toc241409248"/>
-      <w:r>
-        <w:t>Anwendungsfall 10: Fertigmeldung eines Arbeitsgangs durch den Werker</w:t>
-      </w:r>
-      <w:bookmarkEnd w:id="15"/>
-    </w:p>
-    <w:p>
-      <w:pPr>
-        <w:keepNext/>
-      </w:pPr>
-      <w:r>
-        <w:t>Als Werker möchte ich</w:t>
-      </w:r>
-    </w:p>
-    <w:p>
-      <w:pPr>
-        <w:pStyle w:val="Aufzhlungszeichen"/>
-      </w:pPr>
-      <w:r>
-        <w:t>mich am System anmelden</w:t>
-      </w:r>
-    </w:p>
-    <w:p>
-      <w:pPr>
-        <w:pStyle w:val="Aufzhlungszeichen"/>
-      </w:pPr>
-      <w:r>
-        <w:t>den Geschäftsvorfall „Werker-Terminal“ auswählen</w:t>
-      </w:r>
-    </w:p>
-    <w:p>
-      <w:pPr>
-        <w:pStyle w:val="Aufzhlungszeichen"/>
-      </w:pPr>
-      <w:r>
-        <w:t>beim laufenden Arbeitsgang „Fertig melden“ wählen</w:t>
-      </w:r>
-    </w:p>
-    <w:p>
-      <w:pPr>
-        <w:pStyle w:val="Aufzhlungszeichen"/>
-      </w:pPr>
-      <w:r>
-        <w:t xml:space="preserve">die </w:t>
-      </w:r>
-      <w:proofErr w:type="spellStart"/>
-      <w:r>
-        <w:t>Gutmenge</w:t>
-      </w:r>
-      <w:proofErr w:type="spellEnd"/>
-      <w:r>
-        <w:t xml:space="preserve"> und den Ausschuss eingeben, bei Bedarf mit einer Bemerkung</w:t>
-      </w:r>
-    </w:p>
-    <w:p>
-      <w:pPr>
-        <w:pStyle w:val="Aufzhlungszeichen"/>
-      </w:pPr>
-      <w:r>
-        <w:t>die Fertigmeldung speichern. Danach ist der nächste Arbeitsgang des Auftrags bereit</w:t>
-      </w:r>
-    </w:p>
-    <w:p>
-      <w:pPr>
-        <w:pStyle w:val="berschrift2"/>
-      </w:pPr>
-      <w:bookmarkStart w:id="16" w:name="_Toc241409249"/>
-      <w:r>
-        <w:t>Anwendungsfall 11: Nachtragen und Korrigieren von Buchungen durch den Meister</w:t>
-      </w:r>
-      <w:bookmarkEnd w:id="16"/>
-    </w:p>
-    <w:p>
-      <w:pPr>
-        <w:keepNext/>
-      </w:pPr>
-      <w:r>
-        <w:t>Als Meister möchte ich</w:t>
-      </w:r>
-    </w:p>
-    <w:p>
-      <w:pPr>
-        <w:pStyle w:val="Aufzhlungszeichen"/>
-      </w:pPr>
-      <w:r>
-        <w:t>mich am System anmelden</w:t>
-      </w:r>
-    </w:p>
-    <w:p>
-      <w:pPr>
-        <w:pStyle w:val="Aufzhlungszeichen"/>
-      </w:pPr>
-      <w:r>
-        <w:t>den Geschäftsvorfall „Aufträge“ auswählen und einen Auftrag öffnen</w:t>
-      </w:r>
-    </w:p>
-    <w:p>
-      <w:pPr>
-        <w:pStyle w:val="Aufzhlungszeichen"/>
-      </w:pPr>
-      <w:r>
-        <w:t>alle Zeitbuchungen des Auftrags mit Mitarbeiter, Arbeitsgang, Tätigkeit, Beginn, Ende und Dauer sehen</w:t>
-      </w:r>
-    </w:p>
-    <w:p>
-      <w:pPr>
-        <w:pStyle w:val="Aufzhlungszeichen"/>
-      </w:pPr>
-      <w:r>
-        <w:t>eine vergessene Buchung nachtragen oder eine falsche Buchung korrigieren</w:t>
-      </w:r>
-    </w:p>
-    <w:p>
-      <w:pPr>
-        <w:pStyle w:val="Aufzhlungszeichen"/>
-      </w:pPr>
-      <w:r>
-        <w:t>eine Begründung angeben. Ohne Begründung wird nichts gespeichert</w:t>
-      </w:r>
-    </w:p>
-    <w:p>
-      <w:pPr>
-        <w:pStyle w:val="Aufzhlungszeichen"/>
-      </w:pPr>
-      <w:r>
-        <w:t>die Korrektur speichern. Sie wird mit meinem Namen und dem Zeitpunkt protokolliert</w:t>
-      </w:r>
-    </w:p>
-    <w:p>
-      <w:pPr>
-        <w:pStyle w:val="berschrift2"/>
-      </w:pPr>
-      <w:bookmarkStart w:id="17" w:name="_Toc241409250"/>
-      <w:r>
-        <w:t>Anwendungsfall 12: Anzeige der Hallenansicht für den Meister</w:t>
-      </w:r>
-      <w:bookmarkEnd w:id="17"/>
-    </w:p>
-    <w:p>
-      <w:pPr>
-        <w:keepNext/>
-      </w:pPr>
-      <w:r>
-        <w:t>Als Meister möchte ich</w:t>
-      </w:r>
-    </w:p>
-    <w:p>
-      <w:pPr>
-        <w:pStyle w:val="Aufzhlungszeichen"/>
-      </w:pPr>
-      <w:r>
-        <w:t>mich am System anmelden</w:t>
-      </w:r>
-    </w:p>
-    <w:p>
-      <w:pPr>
-        <w:pStyle w:val="Aufzhlungszeichen"/>
-      </w:pPr>
-      <w:r>
-        <w:t>den Geschäftsvorfall „Hallenansicht“ auswählen</w:t>
-      </w:r>
-    </w:p>
-    <w:p>
-      <w:pPr>
-        <w:pStyle w:val="Aufzhlungszeichen"/>
-      </w:pPr>
-      <w:r>
-        <w:t>für jeden aktiven Arbeitsplatz sehen, ob er frei, belegt oder unterbrochen ist</w:t>
-      </w:r>
-    </w:p>
-    <w:p>
-      <w:pPr>
-        <w:pStyle w:val="Aufzhlungszeichen"/>
-      </w:pPr>
-      <w:r>
-        <w:t>bei belegten Arbeitsplätzen sehen, wer an welchem Auftrag und Arbeitsgang arbeitet</w:t>
-      </w:r>
-    </w:p>
-    <w:p>
-      <w:pPr>
-        <w:pStyle w:val="Aufzhlungszeichen"/>
-      </w:pPr>
-      <w:r>
-        <w:t xml:space="preserve">sehen, wie viel der Soll-Zeit verbraucht ist. Die Ampel ist grün bis 80 %, gelb bis 100 % und rot, wenn die Soll-Zeit </w:t>
-      </w:r>
-      <w:proofErr w:type="gramStart"/>
-      <w:r>
-        <w:t>überschritten</w:t>
-      </w:r>
-      <w:proofErr w:type="gramEnd"/>
-      <w:r>
-        <w:t xml:space="preserve"> ist</w:t>
-      </w:r>
-    </w:p>
-    <w:p>
-      <w:pPr>
-        <w:pStyle w:val="Aufzhlungszeichen"/>
-      </w:pPr>
-      <w:r>
-        <w:t>bei Unterbrechungen den Grund und die Dauer sehen</w:t>
-      </w:r>
-    </w:p>
-    <w:p>
-      <w:pPr>
-        <w:pStyle w:val="Aufzhlungszeichen"/>
-      </w:pPr>
-      <w:r>
-        <w:t>eine Liste mit Handlungsbedarf und den letzten Buchungen sehen</w:t>
-      </w:r>
-    </w:p>
-    <w:p>
-      <w:pPr>
-        <w:pStyle w:val="berschrift2"/>
-      </w:pPr>
-      <w:bookmarkStart w:id="18" w:name="_Toc241409251"/>
-      <w:r>
-        <w:lastRenderedPageBreak/>
-        <w:t>Anwendungsfall 13: Anzeige der Auftragsübersicht für alle Rollen</w:t>
-      </w:r>
-      <w:bookmarkEnd w:id="18"/>
-    </w:p>
-    <w:p>
-      <w:pPr>
-        <w:keepNext/>
-      </w:pPr>
-      <w:r>
-        <w:t>Als Mitarbeiter (jeglicher Rolle) möchte ich</w:t>
-      </w:r>
-    </w:p>
-    <w:p>
-      <w:pPr>
-        <w:pStyle w:val="Aufzhlungszeichen"/>
-      </w:pPr>
-      <w:r>
-        <w:t>mich am System anmelden</w:t>
-      </w:r>
-    </w:p>
-    <w:p>
-      <w:pPr>
-        <w:pStyle w:val="Aufzhlungszeichen"/>
-      </w:pPr>
-      <w:r>
-        <w:t>den Geschäftsvorfall „Aufträge“ auswählen</w:t>
-      </w:r>
-    </w:p>
-    <w:p>
-      <w:pPr>
-        <w:pStyle w:val="Aufzhlungszeichen"/>
-      </w:pPr>
-      <w:r>
-        <w:t>eine Liste aller Aufträge mit Artikel, Menge, Liefertermin, Status, Fortschritt, Soll-Zeit und Ist-Zeit sehen</w:t>
-      </w:r>
-    </w:p>
-    <w:p>
-      <w:pPr>
-        <w:pStyle w:val="Aufzhlungszeichen"/>
-      </w:pPr>
-      <w:r>
-        <w:t>die Liste nach Status filtern und nach Auftrag oder Artikel durchsuchen</w:t>
-      </w:r>
-    </w:p>
-    <w:p>
-      <w:pPr>
-        <w:pStyle w:val="Aufzhlungszeichen"/>
-      </w:pPr>
-      <w:r>
-        <w:t>Aufträge mit überschrittenem Liefertermin auf einen Blick erkennen</w:t>
-      </w:r>
-    </w:p>
-    <w:p>
-      <w:pPr>
-        <w:pStyle w:val="berschrift2"/>
-      </w:pPr>
-      <w:bookmarkStart w:id="19" w:name="_Toc241409252"/>
-      <w:r>
-        <w:t>Anwendungsfall 14: Abschluss eines Fertigungsauftrags durch den Meister</w:t>
-      </w:r>
-      <w:bookmarkEnd w:id="19"/>
-    </w:p>
-    <w:p>
-      <w:pPr>
-        <w:keepNext/>
-      </w:pPr>
-      <w:r>
-        <w:t>Als Meister möchte ich</w:t>
-      </w:r>
-    </w:p>
-    <w:p>
-      <w:pPr>
-        <w:pStyle w:val="Aufzhlungszeichen"/>
-      </w:pPr>
-      <w:r>
-        <w:t>mich am System anmelden</w:t>
-      </w:r>
-    </w:p>
-    <w:p>
-      <w:pPr>
-        <w:pStyle w:val="Aufzhlungszeichen"/>
-      </w:pPr>
-      <w:r>
-        <w:t>den Geschäftsvorfall „Aufträge“ auswählen</w:t>
-      </w:r>
-    </w:p>
-    <w:p>
-      <w:pPr>
-        <w:pStyle w:val="Aufzhlungszeichen"/>
-      </w:pPr>
-      <w:r>
-        <w:t>einen Auftrag auswählen, dessen Arbeitsgänge alle erledigt sind</w:t>
-      </w:r>
-    </w:p>
-    <w:p>
-      <w:pPr>
-        <w:pStyle w:val="Aufzhlungszeichen"/>
-      </w:pPr>
-      <w:r>
-        <w:t>die Buchungen und Mengen des Auftrags prüfen</w:t>
-      </w:r>
-    </w:p>
-    <w:p>
-      <w:pPr>
-        <w:pStyle w:val="Aufzhlungszeichen"/>
-      </w:pPr>
-      <w:r>
-        <w:t>den Auftrag abschließen. Danach sind keine Buchungen mehr möglich, und der Auftrag steht für die Nachkalkulation bereit</w:t>
-      </w:r>
-    </w:p>
-    <w:p>
-      <w:pPr>
-        <w:pStyle w:val="berschrift2"/>
-      </w:pPr>
-      <w:bookmarkStart w:id="20" w:name="_Toc241409253"/>
-      <w:r>
-        <w:t>Anwendungsfall 15: Erstellung und Freigabe eines Werkszertifikats durch den Meister</w:t>
-      </w:r>
-      <w:bookmarkEnd w:id="20"/>
-    </w:p>
-    <w:p>
-      <w:pPr>
-        <w:keepNext/>
-      </w:pPr>
-      <w:r>
-        <w:t>Als Meister möchte ich</w:t>
-      </w:r>
-    </w:p>
-    <w:p>
-      <w:pPr>
-        <w:pStyle w:val="Aufzhlungszeichen"/>
-      </w:pPr>
-      <w:r>
-        <w:t>mich am System anmelden</w:t>
-      </w:r>
-    </w:p>
-    <w:p>
-      <w:pPr>
-        <w:pStyle w:val="Aufzhlungszeichen"/>
-      </w:pPr>
-      <w:r>
-        <w:t>den Geschäftsvorfall „Aufträge“ auswählen und einen fertigen Auftrag öffnen</w:t>
-      </w:r>
-    </w:p>
-    <w:p>
-      <w:pPr>
-        <w:pStyle w:val="Aufzhlungszeichen"/>
-      </w:pPr>
-      <w:r>
-        <w:t>die Checklisten und Messwerte aller Arbeitsgänge des Auftrags sehen</w:t>
-      </w:r>
-    </w:p>
-    <w:p>
-      <w:pPr>
-        <w:pStyle w:val="Aufzhlungszeichen"/>
-      </w:pPr>
-      <w:r>
-        <w:t>prüfen, ob alle Prüfpunkte erledigt sind und alle Messwerte in der Toleranz liegen</w:t>
-      </w:r>
-    </w:p>
-    <w:p>
-      <w:pPr>
-        <w:pStyle w:val="Aufzhlungszeichen"/>
-      </w:pPr>
-      <w:r>
-        <w:t>aus diesen Daten ein Werkszertifikat mit Auftrag, Artikel, Menge und Prüfergebnissen erzeugen, zum Beispiel ein Werkszeugnis 2.2 nach DIN EN 10204</w:t>
-      </w:r>
-    </w:p>
-    <w:p>
-      <w:pPr>
-        <w:pStyle w:val="Aufzhlungszeichen"/>
-      </w:pPr>
-      <w:r>
-        <w:t>das Werkszertifikat freigeben und als PDF für den Kunden ablegen</w:t>
-      </w:r>
-    </w:p>
-    <w:p>
-      <w:pPr>
-        <w:pStyle w:val="berschrift2"/>
-      </w:pPr>
-      <w:bookmarkStart w:id="21" w:name="_Toc241409254"/>
-      <w:r>
-        <w:t>Anwendungsfall 16: Nachkalkulation eines Auftrags durch das Controlling</w:t>
-      </w:r>
-      <w:bookmarkEnd w:id="21"/>
-    </w:p>
-    <w:p>
-      <w:pPr>
-        <w:keepNext/>
-      </w:pPr>
-      <w:r>
-        <w:t>Als Controller möchte ich</w:t>
-      </w:r>
-    </w:p>
-    <w:p>
-      <w:pPr>
-        <w:pStyle w:val="Aufzhlungszeichen"/>
-      </w:pPr>
-      <w:r>
-        <w:t>mich am System anmelden</w:t>
-      </w:r>
-    </w:p>
-    <w:p>
-      <w:pPr>
-        <w:pStyle w:val="Aufzhlungszeichen"/>
-      </w:pPr>
-      <w:r>
-        <w:t>den Geschäftsvorfall „Nachkalkulation“ auswählen</w:t>
-      </w:r>
-    </w:p>
-    <w:p>
-      <w:pPr>
-        <w:pStyle w:val="Aufzhlungszeichen"/>
-      </w:pPr>
-      <w:r>
-        <w:t>einen fertigen Auftrag auswählen</w:t>
-      </w:r>
-    </w:p>
-    <w:p>
-      <w:pPr>
-        <w:pStyle w:val="Aufzhlungszeichen"/>
-      </w:pPr>
-      <w:r>
-        <w:t>je Arbeitsgang Soll-Zeit, Ist-Zeit, Soll-Kosten und Ist-Kosten mit Abweichung sehen. Die Ampel ist grün bis +5 %, gelb bis +10 % und rot darüber</w:t>
-      </w:r>
-    </w:p>
-    <w:p>
-      <w:pPr>
-        <w:pStyle w:val="Aufzhlungszeichen"/>
-      </w:pPr>
-      <w:r>
-        <w:t>Rüst- und Bearbeitungszeiten getrennt sehen</w:t>
-      </w:r>
-    </w:p>
-    <w:p>
-      <w:pPr>
-        <w:pStyle w:val="Aufzhlungszeichen"/>
-      </w:pPr>
-      <w:r>
-        <w:t xml:space="preserve">die Kosten pro </w:t>
-      </w:r>
-      <w:proofErr w:type="spellStart"/>
-      <w:r>
-        <w:t>Gutstück</w:t>
-      </w:r>
-      <w:proofErr w:type="spellEnd"/>
-      <w:r>
-        <w:t xml:space="preserve"> sehen</w:t>
-      </w:r>
-    </w:p>
-    <w:p>
-      <w:pPr>
-        <w:pStyle w:val="Aufzhlungszeichen"/>
-      </w:pPr>
-      <w:r>
-        <w:t>die Nachkalkulation abschließen und als CSV-Datei exportieren</w:t>
-      </w:r>
-    </w:p>
-    <w:p>
-      <w:pPr>
-        <w:pStyle w:val="berschrift2"/>
-      </w:pPr>
-      <w:bookmarkStart w:id="22" w:name="_Toc241409255"/>
-      <w:r>
-        <w:t>Anwendungsfall 17: Auswertung über mehrere Aufträge durch das Controlling</w:t>
-      </w:r>
-      <w:bookmarkEnd w:id="22"/>
-    </w:p>
-    <w:p>
-      <w:pPr>
-        <w:keepNext/>
-      </w:pPr>
-      <w:r>
-        <w:t>Als Controller möchte ich</w:t>
-      </w:r>
-    </w:p>
-    <w:p>
-      <w:pPr>
-        <w:pStyle w:val="Aufzhlungszeichen"/>
-      </w:pPr>
-      <w:r>
-        <w:t>mich am System anmelden</w:t>
-      </w:r>
-    </w:p>
-    <w:p>
-      <w:pPr>
-        <w:pStyle w:val="Aufzhlungszeichen"/>
-      </w:pPr>
-      <w:r>
-        <w:t>den Geschäftsvorfall „Auswertung“ auswählen</w:t>
-      </w:r>
-    </w:p>
-    <w:p>
-      <w:pPr>
-        <w:pStyle w:val="Aufzhlungszeichen"/>
-      </w:pPr>
-      <w:r>
-        <w:t>einen Zeitraum und bei Bedarf einen Artikel auswählen</w:t>
-      </w:r>
-    </w:p>
-    <w:p>
-      <w:pPr>
-        <w:pStyle w:val="Aufzhlungszeichen"/>
-      </w:pPr>
-      <w:r>
-        <w:lastRenderedPageBreak/>
-        <w:t xml:space="preserve">eine Liste aller abgeschlossenen Aufträge mit Soll-Kosten, Ist-Kosten, Abweichung und Kosten pro </w:t>
-      </w:r>
-      <w:proofErr w:type="spellStart"/>
-      <w:r>
-        <w:t>Gutstück</w:t>
-      </w:r>
-      <w:proofErr w:type="spellEnd"/>
-      <w:r>
-        <w:t xml:space="preserve"> sehen</w:t>
-      </w:r>
-    </w:p>
-    <w:p>
-      <w:pPr>
-        <w:pStyle w:val="Aufzhlungszeichen"/>
-      </w:pPr>
-      <w:r>
-        <w:t>die Zeitabweichung je Arbeitsplatz sehen</w:t>
-      </w:r>
-    </w:p>
-    <w:p>
-      <w:pPr>
-        <w:pStyle w:val="Aufzhlungszeichen"/>
-      </w:pPr>
-      <w:r>
-        <w:t>die Unterbrechungen nach Grund mit Anzahl, Dauer und Anteil sehen</w:t>
-      </w:r>
-    </w:p>
-    <w:p>
-      <w:pPr>
-        <w:pStyle w:val="Aufzhlungszeichen"/>
-      </w:pPr>
-      <w:r>
-        <w:t>die Auswertung als CSV-Datei exportieren</w:t>
-      </w:r>
-    </w:p>
-    <w:p>
-      <w:pPr>
-        <w:pStyle w:val="berschrift2"/>
-      </w:pPr>
-      <w:bookmarkStart w:id="23" w:name="_Toc241409256"/>
-      <w:r>
-        <w:t>Anwendungsfall 18: Benutzerverwaltung durch den Administrator</w:t>
-      </w:r>
-      <w:bookmarkEnd w:id="23"/>
-    </w:p>
-    <w:p>
-      <w:pPr>
-        <w:keepNext/>
-      </w:pPr>
-      <w:r>
-        <w:t>Als Administrator möchte ich</w:t>
-      </w:r>
-    </w:p>
-    <w:p>
-      <w:pPr>
-        <w:pStyle w:val="Aufzhlungszeichen"/>
-      </w:pPr>
-      <w:r>
-        <w:t>mich am System anmelden</w:t>
-      </w:r>
-    </w:p>
-    <w:p>
-      <w:pPr>
-        <w:pStyle w:val="Aufzhlungszeichen"/>
-      </w:pPr>
-      <w:r>
         <w:t>den Geschäftsvorfall „Benutzer“ auswählen</w:t>
       </w:r>
     </w:p>
@@ -3071,168 +2305,6 @@
       </w:pPr>
       <w:r>
         <w:t>die Änderungen speichern</w:t>
-      </w:r>
-    </w:p>
-    <w:p>
-      <w:pPr>
-        <w:pStyle w:val="berschrift1"/>
-        <w:pageBreakBefore/>
-      </w:pPr>
-      <w:bookmarkStart w:id="24" w:name="_Toc241409257"/>
-      <w:r>
-        <w:lastRenderedPageBreak/>
-        <w:t>Nicht-funktionale Anforderungen</w:t>
-      </w:r>
-      <w:bookmarkEnd w:id="24"/>
-    </w:p>
-    <w:p>
-      <w:pPr>
-        <w:keepNext/>
-      </w:pPr>
-      <w:r>
-        <w:t>Neben den Anwendungsfällen muss die Software die folgenden Anforderungen erfüllen.</w:t>
-      </w:r>
-    </w:p>
-    <w:p>
-      <w:pPr>
-        <w:pStyle w:val="Aufzhlungszeichen"/>
-      </w:pPr>
-      <w:r>
-        <w:rPr>
-          <w:b/>
-        </w:rPr>
-        <w:t xml:space="preserve">Benutzbarkeit: </w:t>
-      </w:r>
-      <w:r>
-        <w:t>Das Werker-Terminal ist per Touch bedienbar, auch mit Arbeitshandschuhen. Schaltflächen sind mindestens 1 cm groß, eine Buchung braucht höchstens zwei Eingaben. Ampelfarben werden immer zusätzlich als Text angezeigt, damit sie auch bei Farbsehschwäche lesbar sind.</w:t>
-      </w:r>
-    </w:p>
-    <w:p>
-      <w:pPr>
-        <w:pStyle w:val="Aufzhlungszeichen"/>
-      </w:pPr>
-      <w:r>
-        <w:rPr>
-          <w:b/>
-        </w:rPr>
-        <w:t xml:space="preserve">Leistung: </w:t>
-      </w:r>
-      <w:r>
-        <w:t>Jede Seite lädt bei bis zu 50 gleichzeitigen Benutzern in weniger als 2 Sekunden. Eine Buchung ist spätestens nach 60 Sekunden in der Hallenansicht sichtbar.</w:t>
-      </w:r>
-    </w:p>
-    <w:p>
-      <w:pPr>
-        <w:pStyle w:val="Aufzhlungszeichen"/>
-      </w:pPr>
-      <w:r>
-        <w:rPr>
-          <w:b/>
-        </w:rPr>
-        <w:t xml:space="preserve">Sicherheit: </w:t>
-      </w:r>
-      <w:r>
-        <w:t>Alle Seiten sind nur nach Anmeldung mit E-Mail und Passwort erreichbar. Passwörter werden nur als Hash gespeichert. Die Rechte der Rollen prüft der Server bei jedem Aufruf. Datenbankabfragen sind gegen SQL-</w:t>
-      </w:r>
-      <w:proofErr w:type="spellStart"/>
-      <w:r>
-        <w:t>Injection</w:t>
-      </w:r>
-      <w:proofErr w:type="spellEnd"/>
-      <w:r>
-        <w:t xml:space="preserve"> geschützt, Formulare gegen CSRF.</w:t>
-      </w:r>
-    </w:p>
-    <w:p>
-      <w:pPr>
-        <w:pStyle w:val="Aufzhlungszeichen"/>
-      </w:pPr>
-      <w:r>
-        <w:rPr>
-          <w:b/>
-        </w:rPr>
-        <w:t xml:space="preserve">Datenschutz und Mitbestimmung: </w:t>
-      </w:r>
-      <w:r>
-        <w:t>Zeitbuchungen sind personenbezogene Daten. Sie werden nur für Auftragsabwicklung und Kalkulation genutzt. Auswertungen zeigen Aufträge und Arbeitsplätze, keine Leistung einzelner Mitarbeiter. Weil die Software geeignet ist, Leistung zu überwachen, muss vor der Einführung der Betriebsrat zustimmen (§ 87 Abs. 1 Nr. 6 BetrVG).</w:t>
-      </w:r>
-    </w:p>
-    <w:p>
-      <w:pPr>
-        <w:pStyle w:val="Aufzhlungszeichen"/>
-      </w:pPr>
-      <w:r>
-        <w:rPr>
-          <w:b/>
-        </w:rPr>
-        <w:t xml:space="preserve">Nachvollziehbarkeit: </w:t>
-      </w:r>
-      <w:r>
-        <w:t>Zeitbuchungen können nicht gelöscht, sondern nur mit Begründung korrigiert werden. Jede Korrektur wird mit Namen und Zeitpunkt gespeichert. Checklisten und Messwerte eines freigegebenen Werkszertifikats können nicht mehr geändert werden.</w:t>
-      </w:r>
-    </w:p>
-    <w:p>
-      <w:pPr>
-        <w:pStyle w:val="Aufzhlungszeichen"/>
-      </w:pPr>
-      <w:r>
-        <w:rPr>
-          <w:b/>
-        </w:rPr>
-        <w:t xml:space="preserve">Datenkonsistenz: </w:t>
-      </w:r>
-      <w:r>
-        <w:t>Zusammengehörige Änderungen, zum Beispiel Fertigmeldung und Statuswechsel, werden vollständig oder gar nicht gespeichert.</w:t>
-      </w:r>
-    </w:p>
-    <w:p>
-      <w:pPr>
-        <w:pStyle w:val="Aufzhlungszeichen"/>
-      </w:pPr>
-      <w:r>
-        <w:rPr>
-          <w:b/>
-        </w:rPr>
-        <w:t xml:space="preserve">Kompatibilität: </w:t>
-      </w:r>
-      <w:r>
-        <w:t>Die Software läuft in aktuellen Versionen von Chrome, Edge und Firefox, auf PCs und auf Tablets ab 10 Zoll. Die Hallenansicht ist auch auf dem Smartphone nutzbar.</w:t>
-      </w:r>
-    </w:p>
-    <w:p>
-      <w:pPr>
-        <w:pStyle w:val="Aufzhlungszeichen"/>
-      </w:pPr>
-      <w:r>
-        <w:rPr>
-          <w:b/>
-        </w:rPr>
-        <w:t xml:space="preserve">Wartbarkeit: </w:t>
-      </w:r>
-      <w:r>
-        <w:t xml:space="preserve">Die Software wird mit HTML, CSS, PHP und </w:t>
-      </w:r>
-      <w:proofErr w:type="spellStart"/>
-      <w:r>
-        <w:t>MariaDB</w:t>
-      </w:r>
-      <w:proofErr w:type="spellEnd"/>
-      <w:r>
-        <w:t xml:space="preserve"> ohne Framework umgesetzt. Die Fachlogik liegt in eigenen Klassen, damit Änderungen an einer Stelle erfolgen.</w:t>
-      </w:r>
-    </w:p>
-    <w:p>
-      <w:pPr>
-        <w:pStyle w:val="Aufzhlungszeichen"/>
-      </w:pPr>
-      <w:r>
-        <w:rPr>
-          <w:b/>
-        </w:rPr>
-        <w:t xml:space="preserve">Verfügbarkeit: </w:t>
-      </w:r>
-      <w:r>
-        <w:t>Die Software ist während der Schichtzeiten von Montag bis Freitag zwischen 6 und 22 Uhr verfügbar.</w:t>
       </w:r>
     </w:p>
     <w:p/>

</xml_diff>